<commit_message>
Deploying to gh-pages from @ digitalservicebund/digitalcheck-dito@4a4904c6fcf744f0f9cd09081cb855a94296df7e 🚀
</commit_message>
<xml_diff>
--- a/documents/VORLAGE_Dokumentation_der_Digitaltauglichkeit_V2.docx
+++ b/documents/VORLAGE_Dokumentation_der_Digitaltauglichkeit_V2.docx
@@ -1,8 +1,8 @@
 
 <file path=word/document.xml><?xml version="1.0" encoding="utf-8"?>
-<w:document xmlns:r="http://schemas.openxmlformats.org/officeDocument/2006/relationships" xmlns:wp="http://schemas.openxmlformats.org/drawingml/2006/wordprocessingDrawing" xmlns:w="http://schemas.openxmlformats.org/wordprocessingml/2006/main" xmlns:w10="urn:schemas-microsoft-com:office:word" xmlns:w14="http://schemas.microsoft.com/office/word/2010/wordml" xmlns:wps="http://schemas.microsoft.com/office/word/2010/wordprocessingShape" xmlns:wpg="http://schemas.microsoft.com/office/word/2010/wordprocessingGroup" xmlns:mc="http://schemas.openxmlformats.org/markup-compatibility/2006" xmlns:v="urn:schemas-microsoft-com:vml" xmlns:o="urn:schemas-microsoft-com:office:office" xmlns:m="http://schemas.openxmlformats.org/officeDocument/2006/math" mc:Ignorable="w14">
+<w:document xmlns:wp14="http://schemas.microsoft.com/office/word/2010/wordprocessingDrawing" xmlns:r="http://schemas.openxmlformats.org/officeDocument/2006/relationships" xmlns:wp="http://schemas.openxmlformats.org/drawingml/2006/wordprocessingDrawing" xmlns:w="http://schemas.openxmlformats.org/wordprocessingml/2006/main" xmlns:w10="urn:schemas-microsoft-com:office:word" xmlns:w14="http://schemas.microsoft.com/office/word/2010/wordml" xmlns:wps="http://schemas.microsoft.com/office/word/2010/wordprocessingShape" xmlns:wpg="http://schemas.microsoft.com/office/word/2010/wordprocessingGroup" xmlns:mc="http://schemas.openxmlformats.org/markup-compatibility/2006" xmlns:v="urn:schemas-microsoft-com:vml" xmlns:o="urn:schemas-microsoft-com:office:office" xmlns:m="http://schemas.openxmlformats.org/officeDocument/2006/math" mc:Ignorable="w14 wp14">
   <w:body>
-    <w:p>
+    <w:p xmlns:wp14="http://schemas.microsoft.com/office/word/2010/wordml" wp14:textId="77777777">
       <w:pPr>
         <w:pStyle w:val="Title A"/>
         <w:keepNext w:val="1"/>
@@ -21,7 +21,7 @@
         <w:t>Dokumentation der Digitaltauglichkeit</w:t>
       </w:r>
     </w:p>
-    <w:p>
+    <w:p xmlns:wp14="http://schemas.microsoft.com/office/word/2010/wordml" wp14:textId="77777777">
       <w:pPr>
         <w:pStyle w:val="Normal.0"/>
       </w:pPr>
@@ -53,7 +53,7 @@
         <w:gridCol w:w="5315"/>
         <w:gridCol w:w="3757"/>
       </w:tblGrid>
-      <w:tr>
+      <w:tr xmlns:wp14="http://schemas.microsoft.com/office/word/2010/wordml" wp14:textId="77777777">
         <w:tblPrEx>
           <w:shd w:val="clear" w:color="auto" w:fill="cad1d7"/>
         </w:tblPrEx>
@@ -62,7 +62,7 @@
         </w:trPr>
         <w:tc>
           <w:tcPr>
-            <w:tcW w:type="dxa" w:w="5315"/>
+            <w:tcW w:w="5315" w:type="dxa"/>
             <w:tcBorders>
               <w:top w:val="nil"/>
               <w:left w:val="nil"/>
@@ -71,14 +71,14 @@
             </w:tcBorders>
             <w:shd w:val="clear" w:color="auto" w:fill="auto"/>
             <w:tcMar>
-              <w:top w:type="dxa" w:w="80"/>
-              <w:left w:type="dxa" w:w="80"/>
-              <w:bottom w:type="dxa" w:w="80"/>
-              <w:right w:type="dxa" w:w="80"/>
+              <w:top w:w="80" w:type="dxa"/>
+              <w:left w:w="80" w:type="dxa"/>
+              <w:bottom w:w="80" w:type="dxa"/>
+              <w:right w:w="80" w:type="dxa"/>
             </w:tcMar>
             <w:vAlign w:val="top"/>
           </w:tcPr>
-          <w:p>
+          <w:p wp14:textId="77777777">
             <w:pPr>
               <w:pStyle w:val="heading 2"/>
               <w:rPr>
@@ -94,7 +94,7 @@
               <w:t>So funktioniert es</w:t>
             </w:r>
           </w:p>
-          <w:p>
+          <w:p wp14:textId="77777777">
             <w:pPr>
               <w:pStyle w:val="List Paragraph"/>
               <w:numPr>
@@ -118,7 +118,7 @@
               <w:t>Bearbeiten Sie die Dokumentation.</w:t>
             </w:r>
           </w:p>
-          <w:p>
+          <w:p wp14:textId="77777777">
             <w:pPr>
               <w:pStyle w:val="List Paragraph"/>
               <w:numPr>
@@ -158,7 +158,7 @@
               <w:t>llte Dokumentation an den NKR.</w:t>
             </w:r>
           </w:p>
-          <w:p>
+          <w:p wp14:textId="77777777">
             <w:pPr>
               <w:pStyle w:val="List Paragraph"/>
               <w:numPr>
@@ -296,7 +296,7 @@
               <w:t>ft die methodische und inhaltliche Nachvollziehbarkeit. Bei Fragen wird der NKR auf Sie zukommen. Das Ziel ist eine digital- und praxistaugliche Umsetzung.</w:t>
             </w:r>
           </w:p>
-          <w:p>
+          <w:p wp14:textId="77777777">
             <w:pPr>
               <w:pStyle w:val="List Paragraph"/>
               <w:numPr>
@@ -441,7 +441,7 @@
               <w:t>.</w:t>
             </w:r>
           </w:p>
-          <w:p>
+          <w:p wp14:textId="77777777">
             <w:pPr>
               <w:pStyle w:val="List Paragraph"/>
               <w:numPr>
@@ -498,7 +498,7 @@
         </w:tc>
         <w:tc>
           <w:tcPr>
-            <w:tcW w:type="dxa" w:w="3757"/>
+            <w:tcW w:w="3757" w:type="dxa"/>
             <w:tcBorders>
               <w:top w:val="nil"/>
               <w:left w:val="nil"/>
@@ -507,14 +507,14 @@
             </w:tcBorders>
             <w:shd w:val="clear" w:color="auto" w:fill="fff9d2"/>
             <w:tcMar>
-              <w:top w:type="dxa" w:w="80"/>
-              <w:left w:type="dxa" w:w="80"/>
-              <w:bottom w:type="dxa" w:w="80"/>
-              <w:right w:type="dxa" w:w="80"/>
+              <w:top w:w="80" w:type="dxa"/>
+              <w:left w:w="80" w:type="dxa"/>
+              <w:bottom w:w="80" w:type="dxa"/>
+              <w:right w:w="80" w:type="dxa"/>
             </w:tcMar>
             <w:vAlign w:val="top"/>
           </w:tcPr>
-          <w:p>
+          <w:p wp14:textId="77777777">
             <w:pPr>
               <w:pStyle w:val="heading 2"/>
               <w:spacing w:line="276" w:lineRule="auto"/>
@@ -533,7 +533,7 @@
               <w:t>Tipps</w:t>
             </w:r>
           </w:p>
-          <w:p>
+          <w:p wp14:textId="77777777">
             <w:pPr>
               <w:pStyle w:val="Fett1"/>
               <w:bidi w:val="0"/>
@@ -626,7 +626,7 @@
               <w:t>ngenden Regelungen eines Vorhabens aus.</w:t>
             </w:r>
           </w:p>
-          <w:p>
+          <w:p wp14:textId="77777777">
             <w:pPr>
               <w:pStyle w:val="Normal.0"/>
               <w:bidi w:val="0"/>
@@ -675,7 +675,7 @@
               <w:t>nge besser erkennen.</w:t>
             </w:r>
           </w:p>
-          <w:p>
+          <w:p wp14:textId="77777777">
             <w:pPr>
               <w:pStyle w:val="Fett1"/>
               <w:bidi w:val="0"/>
@@ -702,7 +702,7 @@
               <w:t>Holen Sie sich eine zweite Meinung ein.</w:t>
             </w:r>
           </w:p>
-          <w:p>
+          <w:p wp14:textId="77777777">
             <w:pPr>
               <w:pStyle w:val="Normal.0"/>
               <w:bidi w:val="0"/>
@@ -729,7 +729,7 @@
               <w:t>Senden Sie das fertige Dokument oder einen Zwischenstand an eine Kollegin oder einen Kollegen.</w:t>
             </w:r>
           </w:p>
-          <w:p>
+          <w:p wp14:textId="77777777">
             <w:pPr>
               <w:pStyle w:val="Fett1"/>
               <w:bidi w:val="0"/>
@@ -756,7 +756,7 @@
               <w:t>Nehmen Sie Ihre Visualisierung als Grundlage</w:t>
             </w:r>
           </w:p>
-          <w:p>
+          <w:p wp14:textId="77777777">
             <w:pPr>
               <w:pStyle w:val="Normal.0"/>
               <w:bidi w:val="0"/>
@@ -869,7 +869,7 @@
         </w:tc>
       </w:tr>
     </w:tbl>
-    <w:p>
+    <w:p xmlns:wp14="http://schemas.microsoft.com/office/word/2010/wordml" wp14:textId="77777777">
       <w:pPr>
         <w:pStyle w:val="Normal.0"/>
         <w:widowControl w:val="0"/>
@@ -877,7 +877,7 @@
         <w:ind w:left="540" w:hanging="540"/>
       </w:pPr>
     </w:p>
-    <w:p>
+    <w:p xmlns:wp14="http://schemas.microsoft.com/office/word/2010/wordml" wp14:textId="77777777">
       <w:pPr>
         <w:pStyle w:val="Normal.0"/>
         <w:widowControl w:val="0"/>
@@ -885,7 +885,7 @@
         <w:ind w:left="432" w:hanging="432"/>
       </w:pPr>
     </w:p>
-    <w:p>
+    <w:p xmlns:wp14="http://schemas.microsoft.com/office/word/2010/wordml" wp14:textId="77777777">
       <w:pPr>
         <w:pStyle w:val="Normal.0"/>
         <w:widowControl w:val="0"/>
@@ -893,7 +893,7 @@
         <w:ind w:left="324" w:hanging="324"/>
       </w:pPr>
     </w:p>
-    <w:p>
+    <w:p xmlns:wp14="http://schemas.microsoft.com/office/word/2010/wordml" wp14:textId="77777777">
       <w:pPr>
         <w:pStyle w:val="Normal.0"/>
         <w:widowControl w:val="0"/>
@@ -901,7 +901,7 @@
         <w:ind w:left="216" w:hanging="216"/>
       </w:pPr>
     </w:p>
-    <w:p>
+    <w:p xmlns:wp14="http://schemas.microsoft.com/office/word/2010/wordml" wp14:textId="77777777">
       <w:pPr>
         <w:pStyle w:val="Normal.0"/>
         <w:widowControl w:val="0"/>
@@ -909,14 +909,14 @@
         <w:ind w:left="108" w:hanging="108"/>
       </w:pPr>
     </w:p>
-    <w:p>
+    <w:p xmlns:wp14="http://schemas.microsoft.com/office/word/2010/wordml" wp14:textId="77777777">
       <w:pPr>
         <w:pStyle w:val="Normal.0"/>
         <w:widowControl w:val="0"/>
         <w:spacing w:line="240" w:lineRule="auto"/>
       </w:pPr>
     </w:p>
-    <w:p>
+    <w:p xmlns:wp14="http://schemas.microsoft.com/office/word/2010/wordml" wp14:textId="77777777">
       <w:pPr>
         <w:pStyle w:val="Normal.0"/>
         <w:pBdr>
@@ -932,7 +932,7 @@
         </w:rPr>
       </w:pPr>
     </w:p>
-    <w:p>
+    <w:p xmlns:wp14="http://schemas.microsoft.com/office/word/2010/wordml" wp14:textId="77777777">
       <w:pPr>
         <w:pStyle w:val="heading 1"/>
         <w:spacing w:before="720"/>
@@ -953,7 +953,7 @@
         <w:t>1. Tragen Sie den Titel Ihres Regelungsvorhaben ein</w:t>
       </w:r>
     </w:p>
-    <w:p>
+    <w:p xmlns:wp14="http://schemas.microsoft.com/office/word/2010/wordml" wp14:textId="77777777">
       <w:pPr>
         <w:pStyle w:val="Textbox"/>
       </w:pPr>
@@ -966,7 +966,7 @@
         <w:t>{{POLICY_TITLE}}</w:t>
       </w:r>
     </w:p>
-    <w:p>
+    <w:p xmlns:wp14="http://schemas.microsoft.com/office/word/2010/wordml" wp14:textId="77777777">
       <w:pPr>
         <w:pStyle w:val="heading 1"/>
         <w:spacing w:before="600"/>
@@ -987,7 +987,7 @@
         <w:t>2. Auswirkungen auf Betroffene und an der Umsetzung Beteiligte</w:t>
       </w:r>
     </w:p>
-    <w:p>
+    <w:p xmlns:wp14="http://schemas.microsoft.com/office/word/2010/wordml" wp14:textId="77777777">
       <w:pPr>
         <w:pStyle w:val="Normal.0"/>
         <w:keepNext w:val="1"/>
@@ -1086,7 +1086,7 @@
         <w:t>rden) gerecht werden.</w:t>
       </w:r>
     </w:p>
-    <w:p>
+    <w:p xmlns:wp14="http://schemas.microsoft.com/office/word/2010/wordml" wp14:textId="77777777">
       <w:pPr>
         <w:pStyle w:val="heading 2"/>
       </w:pPr>
@@ -1147,7 +1147,7 @@
         <w:t>ft?</w:t>
       </w:r>
     </w:p>
-    <w:p>
+    <w:p xmlns:wp14="http://schemas.microsoft.com/office/word/2010/wordml" wp14:textId="77777777">
       <w:pPr>
         <w:pStyle w:val="Textbox"/>
         <w:pBdr>
@@ -1166,7 +1166,7 @@
         <w:t>{{PARTICIPATION_FORMATS}}</w:t>
       </w:r>
     </w:p>
-    <w:p>
+    <w:p xmlns:wp14="http://schemas.microsoft.com/office/word/2010/wordml" wp14:textId="77777777">
       <w:pPr>
         <w:pStyle w:val="heading 2"/>
       </w:pPr>
@@ -1179,7 +1179,7 @@
         <w:t>Wie spiegeln sich die Erkenntnisse, die durch die oben genannten Schritte gewonnen wurde, im Regelungsvorhaben wider?</w:t>
       </w:r>
     </w:p>
-    <w:p>
+    <w:p xmlns:wp14="http://schemas.microsoft.com/office/word/2010/wordml" wp14:textId="77777777">
       <w:pPr>
         <w:pStyle w:val="Textbox"/>
         <w:pBdr>
@@ -1198,7 +1198,7 @@
         <w:t>{{PARTICIPATION_RESULTS}}</w:t>
       </w:r>
     </w:p>
-    <w:p>
+    <w:p xmlns:wp14="http://schemas.microsoft.com/office/word/2010/wordml" wp14:textId="77777777">
       <w:pPr>
         <w:pStyle w:val="Normal.0"/>
         <w:rPr>
@@ -1242,7 +1242,7 @@
       </w:r>
       <w:bookmarkEnd w:id="0"/>
     </w:p>
-    <w:p>
+    <w:p xmlns:wp14="http://schemas.microsoft.com/office/word/2010/wordml" wp14:textId="77777777">
       <w:pPr>
         <w:pStyle w:val="Normal.0"/>
       </w:pPr>
@@ -1263,7 +1263,7 @@
         <w:t>{{PRINCIPLE_1_DESCRIPTION}}</w:t>
       </w:r>
     </w:p>
-    <w:p>
+    <w:p xmlns:wp14="http://schemas.microsoft.com/office/word/2010/wordml" wp14:textId="77777777">
       <w:pPr>
         <w:pStyle w:val="heading 2"/>
       </w:pPr>
@@ -1292,7 +1292,7 @@
         <w:t>sst sich das Vorhaben im Sinne des Prinzips umsetzen?</w:t>
       </w:r>
     </w:p>
-    <w:p>
+    <w:p xmlns:wp14="http://schemas.microsoft.com/office/word/2010/wordml" wp14:textId="77777777">
       <w:pPr>
         <w:pStyle w:val="Erklärung Markierung"/>
       </w:pPr>
@@ -1321,7 +1321,7 @@
         <w:t>schen Sie raus, was nicht zutrifft:</w:t>
       </w:r>
     </w:p>
-    <w:p>
+    <w:p xmlns:wp14="http://schemas.microsoft.com/office/word/2010/wordml" wp14:textId="77777777">
       <w:pPr>
         <w:pStyle w:val="Textbox"/>
         <w:spacing w:before="120"/>
@@ -1335,7 +1335,7 @@
         <w:t>{{PRINCIPLE_1_ANSWER}}</w:t>
       </w:r>
     </w:p>
-    <w:p>
+    <w:p xmlns:wp14="http://schemas.microsoft.com/office/word/2010/wordml" wp14:textId="77777777">
       <w:pPr>
         <w:pStyle w:val="Erklärung Markierung"/>
         <w:spacing w:before="400"/>
@@ -1442,7 +1442,7 @@
         <w:t>nden Sie die Entscheidung und machen Sie bei Punkt 4 weiter.</w:t>
       </w:r>
     </w:p>
-    <w:p>
+    <w:p xmlns:wp14="http://schemas.microsoft.com/office/word/2010/wordml" wp14:textId="77777777">
       <w:pPr>
         <w:pStyle w:val="Textbox Label"/>
         <w:ind w:left="720" w:firstLine="0"/>
@@ -1541,7 +1541,7 @@
         <w:t>}}</w:t>
       </w:r>
     </w:p>
-    <w:p>
+    <w:p xmlns:wp14="http://schemas.microsoft.com/office/word/2010/wordml" wp14:textId="77777777">
       <w:pPr>
         <w:pStyle w:val="Textbox Label"/>
         <w:ind w:left="720" w:firstLine="0"/>
@@ -1571,7 +1571,7 @@
         <w:t>hlte Schwerpunkte</w:t>
       </w:r>
     </w:p>
-    <w:p>
+    <w:p xmlns:wp14="http://schemas.microsoft.com/office/word/2010/wordml" wp14:textId="77777777">
       <w:pPr>
         <w:pStyle w:val="Textbox"/>
         <w:ind w:left="720" w:firstLine="0"/>
@@ -1585,7 +1585,7 @@
         <w:t>{{PRINCIPLE_1_ASPECTS}}</w:t>
       </w:r>
     </w:p>
-    <w:p>
+    <w:p xmlns:wp14="http://schemas.microsoft.com/office/word/2010/wordml" wp14:textId="77777777">
       <w:pPr>
         <w:pStyle w:val="Textbox Label"/>
         <w:ind w:left="720" w:firstLine="0"/>
@@ -1618,7 +1618,7 @@
         <w:t>uterung</w:t>
       </w:r>
     </w:p>
-    <w:p>
+    <w:p xmlns:wp14="http://schemas.microsoft.com/office/word/2010/wordml" wp14:textId="77777777">
       <w:pPr>
         <w:pStyle w:val="Textbox"/>
         <w:pBdr>
@@ -1638,7 +1638,7 @@
         <w:t>{{PRINCIPLE_1_REASONING}}</w:t>
       </w:r>
     </w:p>
-    <w:p>
+    <w:p xmlns:wp14="http://schemas.microsoft.com/office/word/2010/wordml" wp14:textId="77777777">
       <w:pPr>
         <w:pStyle w:val="Normal.0"/>
         <w:rPr>
@@ -1658,8 +1658,6 @@
           <w:szCs w:val="32"/>
         </w:rPr>
         <w:br w:type="textWrapping"/>
-        <w:br w:type="textWrapping"/>
-        <w:br w:type="textWrapping"/>
       </w:r>
       <w:r>
         <w:rPr>
@@ -1668,12 +1666,9 @@
           <w:bCs w:val="1"/>
           <w:sz w:val="32"/>
           <w:szCs w:val="32"/>
-          <w:rtl w:val="0"/>
-          <w:lang w:val="de-DE"/>
-        </w:rPr>
-        <w:t xml:space="preserve">4. </w:t>
-      </w:r>
-      <w:bookmarkStart w:name="datenwiederverwendungbentigteinheitliche" w:id="1"/>
+        </w:rPr>
+        <w:br w:type="textWrapping"/>
+      </w:r>
       <w:r>
         <w:rPr>
           <w:rStyle w:val="None"/>
@@ -1681,6 +1676,29 @@
           <w:bCs w:val="1"/>
           <w:sz w:val="32"/>
           <w:szCs w:val="32"/>
+        </w:rPr>
+        <w:br w:type="textWrapping"/>
+      </w:r>
+      <w:r>
+        <w:rPr>
+          <w:rStyle w:val="None"/>
+          <w:b w:val="1"/>
+          <w:bCs w:val="1"/>
+          <w:sz w:val="32"/>
+          <w:szCs w:val="32"/>
+          <w:rtl w:val="0"/>
+          <w:lang w:val="de-DE"/>
+        </w:rPr>
+        <w:t xml:space="preserve">4. </w:t>
+      </w:r>
+      <w:bookmarkStart w:name="datenwiederverwendungbentigteinheitliche" w:id="1"/>
+      <w:r>
+        <w:rPr>
+          <w:rStyle w:val="None"/>
+          <w:b w:val="1"/>
+          <w:bCs w:val="1"/>
+          <w:sz w:val="32"/>
+          <w:szCs w:val="32"/>
           <w:rtl w:val="0"/>
           <w:lang w:val="de-DE"/>
         </w:rPr>
@@ -1688,7 +1706,7 @@
       </w:r>
       <w:bookmarkEnd w:id="1"/>
     </w:p>
-    <w:p>
+    <w:p xmlns:wp14="http://schemas.microsoft.com/office/word/2010/wordml" wp14:textId="77777777">
       <w:pPr>
         <w:pStyle w:val="Normal.0"/>
       </w:pPr>
@@ -1701,7 +1719,7 @@
         <w:t>{{PRINCIPLE_2_DESCRIPTION}}</w:t>
       </w:r>
     </w:p>
-    <w:p>
+    <w:p xmlns:wp14="http://schemas.microsoft.com/office/word/2010/wordml" wp14:textId="77777777">
       <w:pPr>
         <w:pStyle w:val="heading 2"/>
       </w:pPr>
@@ -1730,7 +1748,7 @@
         <w:t>sst sich das Vorhaben im Sinne des Prinzips umsetzen?</w:t>
       </w:r>
     </w:p>
-    <w:p>
+    <w:p xmlns:wp14="http://schemas.microsoft.com/office/word/2010/wordml" wp14:textId="77777777">
       <w:pPr>
         <w:pStyle w:val="Erklärung Markierung"/>
       </w:pPr>
@@ -1759,7 +1777,7 @@
         <w:t>schen Sie raus, was nicht zutrifft:</w:t>
       </w:r>
     </w:p>
-    <w:p>
+    <w:p xmlns:wp14="http://schemas.microsoft.com/office/word/2010/wordml" wp14:textId="77777777">
       <w:pPr>
         <w:pStyle w:val="Textbox"/>
         <w:spacing w:before="120"/>
@@ -1773,7 +1791,7 @@
         <w:t>{{PRINCIPLE_2_ANSWER}}</w:t>
       </w:r>
     </w:p>
-    <w:p>
+    <w:p xmlns:wp14="http://schemas.microsoft.com/office/word/2010/wordml" wp14:textId="77777777">
       <w:pPr>
         <w:pStyle w:val="Erklärung Markierung"/>
         <w:spacing w:before="400"/>
@@ -1880,7 +1898,7 @@
         <w:t>nden Sie die Entscheidung und machen Sie bei Punkt 5 weiter.</w:t>
       </w:r>
     </w:p>
-    <w:p>
+    <w:p xmlns:wp14="http://schemas.microsoft.com/office/word/2010/wordml" wp14:textId="77777777">
       <w:pPr>
         <w:pStyle w:val="Textbox Label"/>
         <w:ind w:left="720" w:firstLine="0"/>
@@ -2007,7 +2025,7 @@
         <w:t>}}</w:t>
       </w:r>
     </w:p>
-    <w:p>
+    <w:p xmlns:wp14="http://schemas.microsoft.com/office/word/2010/wordml" wp14:textId="77777777">
       <w:pPr>
         <w:pStyle w:val="Textbox Label"/>
         <w:ind w:left="720" w:firstLine="0"/>
@@ -2037,7 +2055,7 @@
         <w:t>hlte Schwerpunkte</w:t>
       </w:r>
     </w:p>
-    <w:p>
+    <w:p xmlns:wp14="http://schemas.microsoft.com/office/word/2010/wordml" wp14:textId="77777777">
       <w:pPr>
         <w:pStyle w:val="Textbox"/>
         <w:ind w:left="720" w:firstLine="0"/>
@@ -2051,7 +2069,7 @@
         <w:t>{{PRINCIPLE_2_ASPECTS}}</w:t>
       </w:r>
     </w:p>
-    <w:p>
+    <w:p xmlns:wp14="http://schemas.microsoft.com/office/word/2010/wordml" wp14:textId="77777777">
       <w:pPr>
         <w:pStyle w:val="Textbox Label"/>
         <w:ind w:left="720" w:firstLine="0"/>
@@ -2081,7 +2099,7 @@
         <w:t>uterung</w:t>
       </w:r>
     </w:p>
-    <w:p>
+    <w:p xmlns:wp14="http://schemas.microsoft.com/office/word/2010/wordml" wp14:textId="77777777">
       <w:pPr>
         <w:pStyle w:val="Textbox"/>
         <w:ind w:left="720" w:firstLine="0"/>
@@ -2095,7 +2113,7 @@
         <w:t>{{PRINCIPLE_2_REASONING}}</w:t>
       </w:r>
     </w:p>
-    <w:p>
+    <w:p xmlns:wp14="http://schemas.microsoft.com/office/word/2010/wordml" wp14:textId="77777777">
       <w:pPr>
         <w:pStyle w:val="Normal.0"/>
         <w:rPr>
@@ -2115,7 +2133,6 @@
           <w:szCs w:val="32"/>
         </w:rPr>
         <w:br w:type="textWrapping"/>
-        <w:br w:type="textWrapping"/>
       </w:r>
       <w:r>
         <w:rPr>
@@ -2124,12 +2141,9 @@
           <w:bCs w:val="1"/>
           <w:sz w:val="32"/>
           <w:szCs w:val="32"/>
-          <w:rtl w:val="0"/>
-          <w:lang w:val="de-DE"/>
-        </w:rPr>
-        <w:t xml:space="preserve">5. </w:t>
-      </w:r>
-      <w:bookmarkStart w:name="etabliertetechnologienermglicheneffizien" w:id="2"/>
+        </w:rPr>
+        <w:br w:type="textWrapping"/>
+      </w:r>
       <w:r>
         <w:rPr>
           <w:rStyle w:val="None"/>
@@ -2140,11 +2154,24 @@
           <w:rtl w:val="0"/>
           <w:lang w:val="de-DE"/>
         </w:rPr>
+        <w:t xml:space="preserve">5. </w:t>
+      </w:r>
+      <w:bookmarkStart w:name="etabliertetechnologienermglicheneffizien" w:id="2"/>
+      <w:r>
+        <w:rPr>
+          <w:rStyle w:val="None"/>
+          <w:b w:val="1"/>
+          <w:bCs w:val="1"/>
+          <w:sz w:val="32"/>
+          <w:szCs w:val="32"/>
+          <w:rtl w:val="0"/>
+          <w:lang w:val="de-DE"/>
+        </w:rPr>
         <w:t>{{PRINCIPLE_3_TITLE}}</w:t>
       </w:r>
       <w:bookmarkEnd w:id="2"/>
     </w:p>
-    <w:p>
+    <w:p xmlns:wp14="http://schemas.microsoft.com/office/word/2010/wordml" wp14:textId="77777777">
       <w:pPr>
         <w:pStyle w:val="Normal.0"/>
       </w:pPr>
@@ -2157,7 +2184,7 @@
         <w:t>{{PRINCIPLE_3_DESCRIPTION}}</w:t>
       </w:r>
     </w:p>
-    <w:p>
+    <w:p xmlns:wp14="http://schemas.microsoft.com/office/word/2010/wordml" wp14:textId="77777777">
       <w:pPr>
         <w:pStyle w:val="heading 2"/>
       </w:pPr>
@@ -2186,7 +2213,7 @@
         <w:t>sst sich das Vorhaben im Sinne des Prinzips umsetzen?</w:t>
       </w:r>
     </w:p>
-    <w:p>
+    <w:p xmlns:wp14="http://schemas.microsoft.com/office/word/2010/wordml" wp14:textId="77777777">
       <w:pPr>
         <w:pStyle w:val="Erklärung Markierung"/>
       </w:pPr>
@@ -2215,7 +2242,7 @@
         <w:t>schen Sie raus, was nicht zutrifft:</w:t>
       </w:r>
     </w:p>
-    <w:p>
+    <w:p xmlns:wp14="http://schemas.microsoft.com/office/word/2010/wordml" wp14:textId="77777777">
       <w:pPr>
         <w:pStyle w:val="Textbox"/>
         <w:spacing w:before="120"/>
@@ -2229,7 +2256,7 @@
         <w:t>{{PRINCIPLE_3_ANSWER}}</w:t>
       </w:r>
     </w:p>
-    <w:p>
+    <w:p xmlns:wp14="http://schemas.microsoft.com/office/word/2010/wordml" wp14:textId="77777777">
       <w:pPr>
         <w:pStyle w:val="Erklärung Markierung"/>
         <w:spacing w:before="400"/>
@@ -2336,7 +2363,7 @@
         <w:t>nden Sie die Entscheidung und machen Sie bei Punkt 6 weiter.</w:t>
       </w:r>
     </w:p>
-    <w:p>
+    <w:p xmlns:wp14="http://schemas.microsoft.com/office/word/2010/wordml" wp14:textId="77777777">
       <w:pPr>
         <w:pStyle w:val="Textbox Label"/>
         <w:ind w:left="720" w:firstLine="0"/>
@@ -2463,7 +2490,7 @@
         <w:t>}}</w:t>
       </w:r>
     </w:p>
-    <w:p>
+    <w:p xmlns:wp14="http://schemas.microsoft.com/office/word/2010/wordml" wp14:textId="77777777">
       <w:pPr>
         <w:pStyle w:val="Textbox Label"/>
         <w:ind w:left="720" w:firstLine="0"/>
@@ -2493,7 +2520,7 @@
         <w:t>hlte Schwerpunkte</w:t>
       </w:r>
     </w:p>
-    <w:p>
+    <w:p xmlns:wp14="http://schemas.microsoft.com/office/word/2010/wordml" wp14:textId="77777777">
       <w:pPr>
         <w:pStyle w:val="Textbox"/>
         <w:ind w:left="720" w:firstLine="0"/>
@@ -2507,7 +2534,7 @@
         <w:t>{{PRINCIPLE_3_ASPECTS}}</w:t>
       </w:r>
     </w:p>
-    <w:p>
+    <w:p xmlns:wp14="http://schemas.microsoft.com/office/word/2010/wordml" wp14:textId="77777777">
       <w:pPr>
         <w:pStyle w:val="Textbox Label"/>
         <w:ind w:left="720" w:firstLine="0"/>
@@ -2537,7 +2564,7 @@
         <w:t>uterung</w:t>
       </w:r>
     </w:p>
-    <w:p>
+    <w:p xmlns:wp14="http://schemas.microsoft.com/office/word/2010/wordml" wp14:textId="77777777">
       <w:pPr>
         <w:pStyle w:val="Textbox"/>
         <w:ind w:left="720" w:firstLine="0"/>
@@ -2551,7 +2578,7 @@
         <w:t>{{PRINCIPLE_3_REASONING}}</w:t>
       </w:r>
     </w:p>
-    <w:p>
+    <w:p xmlns:wp14="http://schemas.microsoft.com/office/word/2010/wordml" wp14:textId="77777777">
       <w:pPr>
         <w:pStyle w:val="Normal.0"/>
         <w:rPr>
@@ -2559,7 +2586,7 @@
         </w:rPr>
       </w:pPr>
     </w:p>
-    <w:p>
+    <w:p xmlns:wp14="http://schemas.microsoft.com/office/word/2010/wordml" wp14:textId="77777777">
       <w:pPr>
         <w:pStyle w:val="Normal.0"/>
         <w:rPr>
@@ -2597,7 +2624,7 @@
       </w:r>
       <w:bookmarkEnd w:id="3"/>
     </w:p>
-    <w:p>
+    <w:p xmlns:wp14="http://schemas.microsoft.com/office/word/2010/wordml" wp14:textId="77777777">
       <w:pPr>
         <w:pStyle w:val="Normal.0"/>
       </w:pPr>
@@ -2610,7 +2637,7 @@
         <w:t>{{PRINCIPLE_4_DESCRIPTION}}</w:t>
       </w:r>
     </w:p>
-    <w:p>
+    <w:p xmlns:wp14="http://schemas.microsoft.com/office/word/2010/wordml" wp14:textId="77777777">
       <w:pPr>
         <w:pStyle w:val="heading 2"/>
       </w:pPr>
@@ -2639,7 +2666,7 @@
         <w:t>sst sich das Vorhaben im Sinne des Prinzips umsetzen?</w:t>
       </w:r>
     </w:p>
-    <w:p>
+    <w:p xmlns:wp14="http://schemas.microsoft.com/office/word/2010/wordml" wp14:textId="77777777">
       <w:pPr>
         <w:pStyle w:val="Erklärung Markierung"/>
       </w:pPr>
@@ -2668,7 +2695,7 @@
         <w:t>schen Sie raus, was nicht zutrifft:</w:t>
       </w:r>
     </w:p>
-    <w:p>
+    <w:p xmlns:wp14="http://schemas.microsoft.com/office/word/2010/wordml" wp14:textId="77777777">
       <w:pPr>
         <w:pStyle w:val="Textbox"/>
         <w:spacing w:before="120"/>
@@ -2682,7 +2709,7 @@
         <w:t>{{PRINCIPLE_4_ANSWER}}</w:t>
       </w:r>
     </w:p>
-    <w:p>
+    <w:p xmlns:wp14="http://schemas.microsoft.com/office/word/2010/wordml" wp14:textId="77777777">
       <w:pPr>
         <w:pStyle w:val="Erklärung Markierung"/>
         <w:spacing w:before="400"/>
@@ -2789,7 +2816,7 @@
         <w:t>nden Sie die Entscheidung und machen Sie bei Punkt 7 weiter.</w:t>
       </w:r>
     </w:p>
-    <w:p>
+    <w:p xmlns:wp14="http://schemas.microsoft.com/office/word/2010/wordml" wp14:textId="77777777">
       <w:pPr>
         <w:pStyle w:val="Textbox Label"/>
         <w:ind w:left="720" w:firstLine="0"/>
@@ -2916,7 +2943,7 @@
         <w:t>}}</w:t>
       </w:r>
     </w:p>
-    <w:p>
+    <w:p xmlns:wp14="http://schemas.microsoft.com/office/word/2010/wordml" wp14:textId="77777777">
       <w:pPr>
         <w:pStyle w:val="Textbox Label"/>
         <w:ind w:left="720" w:firstLine="0"/>
@@ -2946,7 +2973,7 @@
         <w:t>hlte Schwerpunkte</w:t>
       </w:r>
     </w:p>
-    <w:p>
+    <w:p xmlns:wp14="http://schemas.microsoft.com/office/word/2010/wordml" wp14:textId="77777777">
       <w:pPr>
         <w:pStyle w:val="Textbox"/>
         <w:ind w:left="720" w:firstLine="0"/>
@@ -2960,7 +2987,7 @@
         <w:t>{{PRINCIPLE_4_ASPECTS}}</w:t>
       </w:r>
     </w:p>
-    <w:p>
+    <w:p xmlns:wp14="http://schemas.microsoft.com/office/word/2010/wordml" wp14:textId="77777777">
       <w:pPr>
         <w:pStyle w:val="Textbox Label"/>
         <w:ind w:left="720" w:firstLine="0"/>
@@ -2990,7 +3017,7 @@
         <w:t>uterung</w:t>
       </w:r>
     </w:p>
-    <w:p>
+    <w:p xmlns:wp14="http://schemas.microsoft.com/office/word/2010/wordml" wp14:textId="77777777">
       <w:pPr>
         <w:pStyle w:val="Textbox"/>
         <w:ind w:left="720" w:firstLine="0"/>
@@ -3004,7 +3031,7 @@
         <w:t>{{PRINCIPLE_4_REASONING}}</w:t>
       </w:r>
     </w:p>
-    <w:p>
+    <w:p xmlns:wp14="http://schemas.microsoft.com/office/word/2010/wordml" wp14:textId="77777777">
       <w:pPr>
         <w:pStyle w:val="Normal.0"/>
         <w:rPr>
@@ -3052,7 +3079,7 @@
       </w:r>
       <w:bookmarkEnd w:id="4"/>
     </w:p>
-    <w:p>
+    <w:p xmlns:wp14="http://schemas.microsoft.com/office/word/2010/wordml" wp14:textId="77777777">
       <w:pPr>
         <w:pStyle w:val="Normal.0"/>
       </w:pPr>
@@ -3065,7 +3092,7 @@
         <w:t>{{PRINCIPLE_5_DESCRIPTION}}</w:t>
       </w:r>
     </w:p>
-    <w:p>
+    <w:p xmlns:wp14="http://schemas.microsoft.com/office/word/2010/wordml" wp14:textId="77777777">
       <w:pPr>
         <w:pStyle w:val="heading 2"/>
       </w:pPr>
@@ -3094,7 +3121,7 @@
         <w:t>sst sich das Vorhaben im Sinne des Prinzips umsetzen?</w:t>
       </w:r>
     </w:p>
-    <w:p>
+    <w:p xmlns:wp14="http://schemas.microsoft.com/office/word/2010/wordml" wp14:textId="77777777">
       <w:pPr>
         <w:pStyle w:val="Erklärung Markierung"/>
       </w:pPr>
@@ -3123,7 +3150,7 @@
         <w:t>schen Sie raus, was nicht zutrifft:</w:t>
       </w:r>
     </w:p>
-    <w:p>
+    <w:p xmlns:wp14="http://schemas.microsoft.com/office/word/2010/wordml" wp14:textId="77777777">
       <w:pPr>
         <w:pStyle w:val="Textbox"/>
         <w:spacing w:before="120"/>
@@ -3137,7 +3164,7 @@
         <w:t>{{PRINCIPLE_5_ANSWER}}</w:t>
       </w:r>
     </w:p>
-    <w:p>
+    <w:p xmlns:wp14="http://schemas.microsoft.com/office/word/2010/wordml" wp14:textId="77777777">
       <w:pPr>
         <w:pStyle w:val="Erklärung Markierung"/>
         <w:spacing w:before="400"/>
@@ -3244,7 +3271,7 @@
         <w:t>nden Sie die Entscheidung.</w:t>
       </w:r>
     </w:p>
-    <w:p>
+    <w:p xmlns:wp14="http://schemas.microsoft.com/office/word/2010/wordml" wp14:textId="77777777">
       <w:pPr>
         <w:pStyle w:val="Textbox Label"/>
         <w:ind w:left="720" w:firstLine="0"/>
@@ -3371,7 +3398,7 @@
         <w:t>}}</w:t>
       </w:r>
     </w:p>
-    <w:p>
+    <w:p xmlns:wp14="http://schemas.microsoft.com/office/word/2010/wordml" wp14:textId="77777777">
       <w:pPr>
         <w:pStyle w:val="Textbox Label"/>
         <w:ind w:left="720" w:firstLine="0"/>
@@ -3401,7 +3428,7 @@
         <w:t>hlte Schwerpunkte</w:t>
       </w:r>
     </w:p>
-    <w:p>
+    <w:p xmlns:wp14="http://schemas.microsoft.com/office/word/2010/wordml" wp14:textId="77777777">
       <w:pPr>
         <w:pStyle w:val="Textbox"/>
         <w:ind w:left="720" w:firstLine="0"/>
@@ -3415,7 +3442,7 @@
         <w:t>{{PRINCIPLE_5_ASPECTS}}</w:t>
       </w:r>
     </w:p>
-    <w:p>
+    <w:p xmlns:wp14="http://schemas.microsoft.com/office/word/2010/wordml" wp14:textId="77777777">
       <w:pPr>
         <w:pStyle w:val="Textbox Label"/>
         <w:ind w:left="720" w:firstLine="0"/>
@@ -3445,7 +3472,7 @@
         <w:t>uterung</w:t>
       </w:r>
     </w:p>
-    <w:p>
+    <w:p xmlns:wp14="http://schemas.microsoft.com/office/word/2010/wordml" wp14:textId="77777777">
       <w:pPr>
         <w:pStyle w:val="Textbox"/>
         <w:ind w:left="720" w:firstLine="0"/>
@@ -3459,7 +3486,7 @@
         <w:t>{{PRINCIPLE_5_REASONING}}</w:t>
       </w:r>
     </w:p>
-    <w:p>
+    <w:p xmlns:wp14="http://schemas.microsoft.com/office/word/2010/wordml" wp14:textId="77777777">
       <w:pPr>
         <w:pStyle w:val="Normal.0"/>
         <w:pBdr>
@@ -3470,7 +3497,7 @@
         </w:pBdr>
       </w:pPr>
     </w:p>
-    <w:p>
+    <w:p xmlns:wp14="http://schemas.microsoft.com/office/word/2010/wordml" wp14:textId="77777777">
       <w:pPr>
         <w:pStyle w:val="heading 1"/>
         <w:spacing w:before="720"/>
@@ -3491,7 +3518,7 @@
         <w:t>Das ist jetzt zu tun</w:t>
       </w:r>
     </w:p>
-    <w:p>
+    <w:p xmlns:wp14="http://schemas.microsoft.com/office/word/2010/wordml" wp14:textId="77777777">
       <w:pPr>
         <w:pStyle w:val="List Paragraph"/>
         <w:numPr>
@@ -3535,7 +3562,7 @@
         <w:t>PDF</w:t>
       </w:r>
     </w:p>
-    <w:p>
+    <w:p xmlns:wp14="http://schemas.microsoft.com/office/word/2010/wordml" wp14:textId="77777777">
       <w:pPr>
         <w:pStyle w:val="List Paragraph"/>
         <w:numPr>
@@ -3639,7 +3666,7 @@
         <w:t>cksichtigung der Prinzipien digitaltauglicher Gesetzgebung. Bei Fragen wird der NKR auf Sie zukommen.</w:t>
       </w:r>
     </w:p>
-    <w:p>
+    <w:p xmlns:wp14="http://schemas.microsoft.com/office/word/2010/wordml" wp14:textId="77777777">
       <w:pPr>
         <w:pStyle w:val="List Paragraph"/>
         <w:numPr>
@@ -3731,7 +3758,7 @@
         <w:t>.</w:t>
       </w:r>
     </w:p>
-    <w:p>
+    <w:p xmlns:wp14="http://schemas.microsoft.com/office/word/2010/wordml" wp14:textId="77777777">
       <w:pPr>
         <w:pStyle w:val="List Paragraph"/>
         <w:numPr>
@@ -3781,7 +3808,7 @@
         <w:t>ngen Sie diese formlos als PDF oder als Screenshot an.</w:t>
       </w:r>
     </w:p>
-    <w:p>
+    <w:p xmlns:wp14="http://schemas.microsoft.com/office/word/2010/wordml" wp14:textId="77777777">
       <w:pPr>
         <w:pStyle w:val="List Paragraph"/>
         <w:numPr>
@@ -3821,7 +3848,7 @@
         <w:t>r Sie beendet.</w:t>
       </w:r>
     </w:p>
-    <w:p>
+    <w:p xmlns:wp14="http://schemas.microsoft.com/office/word/2010/wordml" wp14:textId="77777777">
       <w:pPr>
         <w:pStyle w:val="heading 2"/>
       </w:pPr>
@@ -3850,7 +3877,7 @@
         <w:t>ft der Nationale Normenkontrollrat</w:t>
       </w:r>
     </w:p>
-    <w:p>
+    <w:p xmlns:wp14="http://schemas.microsoft.com/office/word/2010/wordml" wp14:textId="77777777">
       <w:pPr>
         <w:pStyle w:val="Normal.0"/>
       </w:pPr>
@@ -3991,7 +4018,7 @@
         <w:t>ngt werden. Bei Fragen oder Anregungen kommt Ihre Ansprechperson im NKR-Sekretariat auf Sie zu.</w:t>
       </w:r>
     </w:p>
-    <w:p>
+    <w:p xmlns:wp14="http://schemas.microsoft.com/office/word/2010/wordml" wp14:textId="77777777">
       <w:pPr>
         <w:pStyle w:val="heading 2"/>
       </w:pPr>
@@ -4036,7 +4063,7 @@
         <w:t xml:space="preserve">tzung? </w:t>
       </w:r>
     </w:p>
-    <w:p>
+    <w:p xmlns:wp14="http://schemas.microsoft.com/office/word/2010/wordml" wp14:textId="77777777">
       <w:pPr>
         <w:pStyle w:val="Normal.0"/>
       </w:pPr>
@@ -4092,14 +4119,15 @@
       <w:pgSz w:w="11900" w:h="16840" w:orient="portrait"/>
       <w:pgMar w:top="1440" w:right="1440" w:bottom="1440" w:left="1440" w:header="708" w:footer="709"/>
       <w:bidi w:val="0"/>
+      <w:cols w:num="1"/>
     </w:sectPr>
   </w:body>
 </w:document>
 </file>
 
 <file path=word/footer1.xml><?xml version="1.0" encoding="utf-8"?>
-<w:ftr xmlns:r="http://schemas.openxmlformats.org/officeDocument/2006/relationships" xmlns:wp="http://schemas.openxmlformats.org/drawingml/2006/wordprocessingDrawing" xmlns:w="http://schemas.openxmlformats.org/wordprocessingml/2006/main" xmlns:w10="urn:schemas-microsoft-com:office:word" xmlns:w14="http://schemas.microsoft.com/office/word/2010/wordml" xmlns:wps="http://schemas.microsoft.com/office/word/2010/wordprocessingShape" xmlns:wpg="http://schemas.microsoft.com/office/word/2010/wordprocessingGroup" xmlns:mc="http://schemas.openxmlformats.org/markup-compatibility/2006" xmlns:v="urn:schemas-microsoft-com:vml" xmlns:o="urn:schemas-microsoft-com:office:office" xmlns:m="http://schemas.openxmlformats.org/officeDocument/2006/math" mc:Ignorable="w14">
-  <w:p>
+<w:ftr xmlns:wp14="http://schemas.microsoft.com/office/word/2010/wordprocessingDrawing" xmlns:r="http://schemas.openxmlformats.org/officeDocument/2006/relationships" xmlns:wp="http://schemas.openxmlformats.org/drawingml/2006/wordprocessingDrawing" xmlns:w="http://schemas.openxmlformats.org/wordprocessingml/2006/main" xmlns:w10="urn:schemas-microsoft-com:office:word" xmlns:w14="http://schemas.microsoft.com/office/word/2010/wordml" xmlns:wps="http://schemas.microsoft.com/office/word/2010/wordprocessingShape" xmlns:wpg="http://schemas.microsoft.com/office/word/2010/wordprocessingGroup" xmlns:mc="http://schemas.openxmlformats.org/markup-compatibility/2006" xmlns:v="urn:schemas-microsoft-com:vml" xmlns:o="urn:schemas-microsoft-com:office:office" xmlns:m="http://schemas.openxmlformats.org/officeDocument/2006/math" mc:Ignorable="w14 wp14">
+  <w:p xmlns:wp14="http://schemas.microsoft.com/office/word/2010/wordml" wp14:textId="77777777">
     <w:pPr>
       <w:pStyle w:val="Header &amp; Footer"/>
       <w:bidi w:val="0"/>
@@ -4110,67 +4138,65 @@
 </file>
 
 <file path=word/header1.xml><?xml version="1.0" encoding="utf-8"?>
-<w:hdr xmlns:r="http://schemas.openxmlformats.org/officeDocument/2006/relationships" xmlns:wp="http://schemas.openxmlformats.org/drawingml/2006/wordprocessingDrawing" xmlns:w="http://schemas.openxmlformats.org/wordprocessingml/2006/main" xmlns:w10="urn:schemas-microsoft-com:office:word" xmlns:w14="http://schemas.microsoft.com/office/word/2010/wordml" xmlns:wps="http://schemas.microsoft.com/office/word/2010/wordprocessingShape" xmlns:wpg="http://schemas.microsoft.com/office/word/2010/wordprocessingGroup" xmlns:mc="http://schemas.openxmlformats.org/markup-compatibility/2006" xmlns:v="urn:schemas-microsoft-com:vml" xmlns:o="urn:schemas-microsoft-com:office:office" xmlns:m="http://schemas.openxmlformats.org/officeDocument/2006/math" mc:Ignorable="w14">
-  <w:p>
+<w:hdr xmlns:wp14="http://schemas.microsoft.com/office/word/2010/wordprocessingDrawing" xmlns:r="http://schemas.openxmlformats.org/officeDocument/2006/relationships" xmlns:wp="http://schemas.openxmlformats.org/drawingml/2006/wordprocessingDrawing" xmlns:w="http://schemas.openxmlformats.org/wordprocessingml/2006/main" xmlns:w10="urn:schemas-microsoft-com:office:word" xmlns:w14="http://schemas.microsoft.com/office/word/2010/wordml" xmlns:wps="http://schemas.microsoft.com/office/word/2010/wordprocessingShape" xmlns:wpg="http://schemas.microsoft.com/office/word/2010/wordprocessingGroup" xmlns:mc="http://schemas.openxmlformats.org/markup-compatibility/2006" xmlns:v="urn:schemas-microsoft-com:vml" xmlns:o="urn:schemas-microsoft-com:office:office" xmlns:m="http://schemas.openxmlformats.org/officeDocument/2006/math" xmlns:a="http://schemas.openxmlformats.org/drawingml/2006/main" xmlns:pic="http://schemas.openxmlformats.org/drawingml/2006/picture" mc:Ignorable="w14 wp14">
+  <w:p xmlns:wp14="http://schemas.microsoft.com/office/word/2010/wordml" wp14:textId="5BE351F0">
     <w:pPr>
       <w:pStyle w:val="Normal.0"/>
       <w:tabs>
         <w:tab w:val="left" w:pos="453"/>
         <w:tab w:val="right" w:pos="4330"/>
       </w:tabs>
-      <w:spacing w:before="120" w:after="0" w:line="24" w:lineRule="auto"/>
+      <w:spacing w:before="120" w:beforeAutospacing="off" w:after="120" w:afterAutospacing="off" w:line="360" w:lineRule="auto"/>
       <w:jc w:val="right"/>
       <w:rPr>
-        <w:shd w:val="nil" w:color="auto" w:fill="auto"/>
+        <w:rtl w:val="0"/>
+        <w:lang w:val="de-DE"/>
       </w:rPr>
     </w:pPr>
     <w:r>
       <w:rPr>
         <w:shd w:val="nil" w:color="auto" w:fill="auto"/>
-        <w:rtl w:val="0"/>
         <w:lang w:val="de-DE"/>
       </w:rPr>
       <w:t>Version Februar 2026</w:t>
     </w:r>
     <w:r>
       <w:rPr>
-        <w:shd w:val="nil" w:color="auto" w:fill="auto"/>
+        <w:lang w:val="de-DE"/>
       </w:rPr>
-      <w:br w:type="textWrapping"/>
-      <w:br w:type="textWrapping"/>
+      <w:t xml:space="preserve"> </w:t>
     </w:r>
     <w:r>
       <w:rPr>
-        <w:shd w:val="nil" w:color="auto" w:fill="auto"/>
-        <w:rtl w:val="0"/>
         <w:lang w:val="de-DE"/>
       </w:rPr>
       <w:t>Datum: 2.3.2026</w:t>
-      <w:tab/>
     </w:r>
   </w:p>
-  <w:p>
+  <w:p xmlns:wp14="http://schemas.microsoft.com/office/word/2010/wordml" wp14:textId="60E0B1BA">
     <w:pPr>
       <w:pStyle w:val="Normal.0"/>
       <w:tabs>
         <w:tab w:val="left" w:pos="453"/>
         <w:tab w:val="right" w:pos="4330"/>
       </w:tabs>
-      <w:spacing w:before="120" w:after="0" w:line="24" w:lineRule="auto"/>
+      <w:spacing w:before="120" w:beforeAutospacing="off" w:after="120" w:afterAutospacing="off" w:line="360" w:lineRule="auto"/>
       <w:jc w:val="right"/>
+      <w:rPr>
+        <w:shd w:val="nil" w:color="auto" w:fill="auto"/>
+        <w:rtl w:val="0"/>
+        <w:lang w:val="de-DE"/>
+      </w:rPr>
     </w:pPr>
     <w:r>
-      <w:rPr>
-        <w:shd w:val="nil" w:color="auto" w:fill="auto"/>
-      </w:rPr>
-      <w:drawing xmlns:a="http://schemas.openxmlformats.org/drawingml/2006/main">
-        <wp:inline distT="0" distB="0" distL="0" distR="0">
+      <w:drawing>
+        <wp:inline xmlns:wp14="http://schemas.microsoft.com/office/word/2010/wordprocessingDrawing" wp14:editId="353117C5" wp14:anchorId="6B87D31B">
           <wp:extent cx="1343025" cy="276225"/>
           <wp:effectExtent l="0" t="0" r="0" b="0"/>
-          <wp:docPr id="1073741825" name="officeArt object" descr="Logo des Digitalchecks"/>
+          <wp:docPr id="1623274816" name="officeArt object" descr="Logo des Digitalchecks"/>
           <wp:cNvGraphicFramePr/>
-          <a:graphic xmlns:a="http://schemas.openxmlformats.org/drawingml/2006/main">
-            <a:graphicData uri="http://schemas.openxmlformats.org/drawingml/2006/picture">
+          <a:graphic>
+            <a:graphicData xmlns:a="http://schemas.openxmlformats.org/drawingml/2006/main" uri="http://schemas.openxmlformats.org/drawingml/2006/picture">
               <pic:pic xmlns:pic="http://schemas.openxmlformats.org/drawingml/2006/picture">
                 <pic:nvPicPr>
                   <pic:cNvPr id="1073741825" name="Logo des Digitalchecks" descr="Logo des Digitalchecks"/>
@@ -4179,7 +4205,7 @@
                   </pic:cNvPicPr>
                 </pic:nvPicPr>
                 <pic:blipFill>
-                  <a:blip r:embed="rId1">
+                  <a:blip xmlns:r="http://schemas.openxmlformats.org/officeDocument/2006/relationships" r:embed="rId1">
                     <a:extLst/>
                   </a:blip>
                   <a:stretch>
@@ -4213,6 +4239,7 @@
 <file path=word/numbering.xml><?xml version="1.0" encoding="utf-8"?>
 <w:numbering xmlns:w="http://schemas.openxmlformats.org/wordprocessingml/2006/main" xmlns:wp="http://schemas.openxmlformats.org/drawingml/2006/wordprocessingDrawing" xmlns:w14="http://schemas.microsoft.com/office/word/2010/wordml" xmlns:r="http://schemas.openxmlformats.org/officeDocument/2006/relationships" xmlns:v="urn:schemas-microsoft-com:vml" xmlns:o="urn:schemas-microsoft-com:office:office">
   <w:abstractNum w:abstractNumId="0">
+    <w:nsid w:val="66aed352"/>
     <w:multiLevelType w:val="hybridMultilevel"/>
     <w:lvl w:ilvl="0">
       <w:start w:val="1"/>
@@ -4450,6 +4477,7 @@
     </w:lvl>
   </w:abstractNum>
   <w:abstractNum w:abstractNumId="1">
+    <w:nsid w:val="1d89f15c"/>
     <w:multiLevelType w:val="hybridMultilevel"/>
     <w:lvl w:ilvl="0">
       <w:start w:val="1"/>
@@ -4461,7 +4489,7 @@
         <w:ind w:left="114" w:hanging="114"/>
       </w:pPr>
       <w:rPr>
-        <w:rFonts w:ascii="Times New Roman" w:cs="Times New Roman" w:hAnsi="Times New Roman" w:eastAsia="Times New Roman"/>
+        <w:rFonts w:ascii="Times New Roman" w:hAnsi="Times New Roman" w:eastAsia="Times New Roman" w:cs="Times New Roman"/>
         <w:b w:val="0"/>
         <w:bCs w:val="0"/>
         <w:i w:val="0"/>
@@ -4491,7 +4519,7 @@
         <w:ind w:left="737" w:hanging="283"/>
       </w:pPr>
       <w:rPr>
-        <w:rFonts w:ascii="Symbol" w:cs="Symbol" w:hAnsi="Symbol" w:eastAsia="Symbol"/>
+        <w:rFonts w:ascii="Symbol" w:hAnsi="Symbol" w:eastAsia="Symbol" w:cs="Symbol"/>
         <w:b w:val="0"/>
         <w:bCs w:val="0"/>
         <w:i w:val="0"/>
@@ -4521,7 +4549,7 @@
         <w:ind w:left="1191" w:hanging="283"/>
       </w:pPr>
       <w:rPr>
-        <w:rFonts w:ascii="Symbol" w:cs="Symbol" w:hAnsi="Symbol" w:eastAsia="Symbol"/>
+        <w:rFonts w:ascii="Symbol" w:hAnsi="Symbol" w:eastAsia="Symbol" w:cs="Symbol"/>
         <w:b w:val="0"/>
         <w:bCs w:val="0"/>
         <w:i w:val="0"/>
@@ -4551,7 +4579,7 @@
         <w:ind w:left="1645" w:hanging="283"/>
       </w:pPr>
       <w:rPr>
-        <w:rFonts w:ascii="Symbol" w:cs="Symbol" w:hAnsi="Symbol" w:eastAsia="Symbol"/>
+        <w:rFonts w:ascii="Symbol" w:hAnsi="Symbol" w:eastAsia="Symbol" w:cs="Symbol"/>
         <w:b w:val="0"/>
         <w:bCs w:val="0"/>
         <w:i w:val="0"/>
@@ -4581,7 +4609,7 @@
         <w:ind w:left="2099" w:hanging="283"/>
       </w:pPr>
       <w:rPr>
-        <w:rFonts w:ascii="Symbol" w:cs="Symbol" w:hAnsi="Symbol" w:eastAsia="Symbol"/>
+        <w:rFonts w:ascii="Symbol" w:hAnsi="Symbol" w:eastAsia="Symbol" w:cs="Symbol"/>
         <w:b w:val="0"/>
         <w:bCs w:val="0"/>
         <w:i w:val="0"/>
@@ -4611,7 +4639,7 @@
         <w:ind w:left="2553" w:hanging="283"/>
       </w:pPr>
       <w:rPr>
-        <w:rFonts w:ascii="Symbol" w:cs="Symbol" w:hAnsi="Symbol" w:eastAsia="Symbol"/>
+        <w:rFonts w:ascii="Symbol" w:hAnsi="Symbol" w:eastAsia="Symbol" w:cs="Symbol"/>
         <w:b w:val="0"/>
         <w:bCs w:val="0"/>
         <w:i w:val="0"/>
@@ -4641,7 +4669,7 @@
         <w:ind w:left="3007" w:hanging="283"/>
       </w:pPr>
       <w:rPr>
-        <w:rFonts w:ascii="Symbol" w:cs="Symbol" w:hAnsi="Symbol" w:eastAsia="Symbol"/>
+        <w:rFonts w:ascii="Symbol" w:hAnsi="Symbol" w:eastAsia="Symbol" w:cs="Symbol"/>
         <w:b w:val="0"/>
         <w:bCs w:val="0"/>
         <w:i w:val="0"/>
@@ -4671,7 +4699,7 @@
         <w:ind w:left="3461" w:hanging="283"/>
       </w:pPr>
       <w:rPr>
-        <w:rFonts w:ascii="Symbol" w:cs="Symbol" w:hAnsi="Symbol" w:eastAsia="Symbol"/>
+        <w:rFonts w:ascii="Symbol" w:hAnsi="Symbol" w:eastAsia="Symbol" w:cs="Symbol"/>
         <w:b w:val="0"/>
         <w:bCs w:val="0"/>
         <w:i w:val="0"/>
@@ -4701,7 +4729,7 @@
         <w:ind w:left="3915" w:hanging="283"/>
       </w:pPr>
       <w:rPr>
-        <w:rFonts w:ascii="Symbol" w:cs="Symbol" w:hAnsi="Symbol" w:eastAsia="Symbol"/>
+        <w:rFonts w:ascii="Symbol" w:hAnsi="Symbol" w:eastAsia="Symbol" w:cs="Symbol"/>
         <w:b w:val="0"/>
         <w:bCs w:val="0"/>
         <w:i w:val="0"/>
@@ -4723,10 +4751,12 @@
     </w:lvl>
   </w:abstractNum>
   <w:abstractNum w:abstractNumId="2">
+    <w:nsid w:val="2245f19b"/>
     <w:multiLevelType w:val="hybridMultilevel"/>
     <w:numStyleLink w:val="Imported Style 3"/>
   </w:abstractNum>
   <w:abstractNum w:abstractNumId="3">
+    <w:nsid w:val="5f235d51"/>
     <w:multiLevelType w:val="hybridMultilevel"/>
     <w:styleLink w:val="Imported Style 3"/>
     <w:lvl w:ilvl="0">
@@ -4739,7 +4769,7 @@
         <w:ind w:left="360" w:hanging="144"/>
       </w:pPr>
       <w:rPr>
-        <w:rFonts w:ascii="Arial" w:cs="Arial" w:hAnsi="Arial" w:eastAsia="Arial"/>
+        <w:rFonts w:ascii="Arial" w:hAnsi="Arial" w:eastAsia="Arial" w:cs="Arial"/>
         <w:b w:val="0"/>
         <w:bCs w:val="0"/>
         <w:i w:val="0"/>
@@ -4769,7 +4799,7 @@
         <w:ind w:left="864" w:hanging="144"/>
       </w:pPr>
       <w:rPr>
-        <w:rFonts w:ascii="Arial" w:cs="Arial" w:hAnsi="Arial" w:eastAsia="Arial"/>
+        <w:rFonts w:ascii="Arial" w:hAnsi="Arial" w:eastAsia="Arial" w:cs="Arial"/>
         <w:b w:val="0"/>
         <w:bCs w:val="0"/>
         <w:i w:val="0"/>
@@ -4799,7 +4829,7 @@
         <w:ind w:left="1584" w:hanging="144"/>
       </w:pPr>
       <w:rPr>
-        <w:rFonts w:ascii="Arial" w:cs="Arial" w:hAnsi="Arial" w:eastAsia="Arial"/>
+        <w:rFonts w:ascii="Arial" w:hAnsi="Arial" w:eastAsia="Arial" w:cs="Arial"/>
         <w:b w:val="0"/>
         <w:bCs w:val="0"/>
         <w:i w:val="0"/>
@@ -4829,7 +4859,7 @@
         <w:ind w:left="2304" w:hanging="144"/>
       </w:pPr>
       <w:rPr>
-        <w:rFonts w:ascii="Arial" w:cs="Arial" w:hAnsi="Arial" w:eastAsia="Arial"/>
+        <w:rFonts w:ascii="Arial" w:hAnsi="Arial" w:eastAsia="Arial" w:cs="Arial"/>
         <w:b w:val="0"/>
         <w:bCs w:val="0"/>
         <w:i w:val="0"/>
@@ -4859,7 +4889,7 @@
         <w:ind w:left="3024" w:hanging="144"/>
       </w:pPr>
       <w:rPr>
-        <w:rFonts w:ascii="Arial" w:cs="Arial" w:hAnsi="Arial" w:eastAsia="Arial"/>
+        <w:rFonts w:ascii="Arial" w:hAnsi="Arial" w:eastAsia="Arial" w:cs="Arial"/>
         <w:b w:val="0"/>
         <w:bCs w:val="0"/>
         <w:i w:val="0"/>
@@ -4889,7 +4919,7 @@
         <w:ind w:left="3744" w:hanging="144"/>
       </w:pPr>
       <w:rPr>
-        <w:rFonts w:ascii="Arial" w:cs="Arial" w:hAnsi="Arial" w:eastAsia="Arial"/>
+        <w:rFonts w:ascii="Arial" w:hAnsi="Arial" w:eastAsia="Arial" w:cs="Arial"/>
         <w:b w:val="0"/>
         <w:bCs w:val="0"/>
         <w:i w:val="0"/>
@@ -4919,7 +4949,7 @@
         <w:ind w:left="4464" w:hanging="144"/>
       </w:pPr>
       <w:rPr>
-        <w:rFonts w:ascii="Arial" w:cs="Arial" w:hAnsi="Arial" w:eastAsia="Arial"/>
+        <w:rFonts w:ascii="Arial" w:hAnsi="Arial" w:eastAsia="Arial" w:cs="Arial"/>
         <w:b w:val="0"/>
         <w:bCs w:val="0"/>
         <w:i w:val="0"/>
@@ -4949,7 +4979,7 @@
         <w:ind w:left="5184" w:hanging="144"/>
       </w:pPr>
       <w:rPr>
-        <w:rFonts w:ascii="Arial" w:cs="Arial" w:hAnsi="Arial" w:eastAsia="Arial"/>
+        <w:rFonts w:ascii="Arial" w:hAnsi="Arial" w:eastAsia="Arial" w:cs="Arial"/>
         <w:b w:val="0"/>
         <w:bCs w:val="0"/>
         <w:i w:val="0"/>
@@ -4979,7 +5009,7 @@
         <w:ind w:left="5904" w:hanging="144"/>
       </w:pPr>
       <w:rPr>
-        <w:rFonts w:ascii="Arial" w:cs="Arial" w:hAnsi="Arial" w:eastAsia="Arial"/>
+        <w:rFonts w:ascii="Arial" w:hAnsi="Arial" w:eastAsia="Arial" w:cs="Arial"/>
         <w:b w:val="0"/>
         <w:bCs w:val="0"/>
         <w:i w:val="0"/>
@@ -5016,11 +5046,11 @@
 </file>
 
 <file path=word/styles.xml><?xml version="1.0" encoding="utf-8"?>
-<w:styles xmlns:w="http://schemas.openxmlformats.org/wordprocessingml/2006/main" xmlns:mc="http://schemas.openxmlformats.org/markup-compatibility/2006" xmlns:w14="http://schemas.microsoft.com/office/word/2010/wordml" mc:Ignorable="w14">
+<w:styles xmlns:wp14="http://schemas.microsoft.com/office/word/2010/wordprocessingDrawing" xmlns:w="http://schemas.openxmlformats.org/wordprocessingml/2006/main" xmlns:mc="http://schemas.openxmlformats.org/markup-compatibility/2006" xmlns:w14="http://schemas.microsoft.com/office/word/2010/wordml" mc:Ignorable="w14 wp14">
   <w:docDefaults>
     <w:rPrDefault>
       <w:rPr>
-        <w:rFonts w:ascii="Times New Roman" w:cs="Times New Roman" w:hAnsi="Times New Roman" w:eastAsia="Arial Unicode MS"/>
+        <w:rFonts w:ascii="Times New Roman" w:hAnsi="Times New Roman" w:eastAsia="Arial Unicode MS" w:cs="Times New Roman"/>
         <w:b w:val="0"/>
         <w:bCs w:val="0"/>
         <w:i w:val="0"/>
@@ -5051,7 +5081,7 @@
         <w:keepNext w:val="0"/>
         <w:keepLines w:val="0"/>
         <w:pageBreakBefore w:val="0"/>
-        <w:framePr w:anchorLock="0" w:w="0" w:h="0" w:vSpace="0" w:hSpace="0" w:xAlign="left" w:y="0" w:hRule="exact" w:vAnchor="margin"/>
+        <w:framePr w:w="0" w:h="0" w:vSpace="0" w:hSpace="0" w:vAnchor="margin" w:xAlign="left" w:y="0" w:hRule="exact" w:anchorLock="0"/>
         <w:widowControl w:val="1"/>
         <w:numPr>
           <w:ilvl w:val="0"/>
@@ -5075,7 +5105,7 @@
       </w:pPr>
     </w:pPrDefault>
   </w:docDefaults>
-  <w:style w:type="paragraph" w:default="1" w:styleId="Normal">
+  <w:style w:type="paragraph" w:styleId="Normal" w:default="1">
     <w:name w:val="Normal"/>
     <w:next w:val="Normal"/>
     <w:pPr/>
@@ -5085,7 +5115,7 @@
       <w:lang w:val="en-US" w:eastAsia="en-US" w:bidi="ar-SA"/>
     </w:rPr>
   </w:style>
-  <w:style w:type="character" w:default="1" w:styleId="Default Paragraph Font">
+  <w:style w:type="character" w:styleId="Default Paragraph Font" w:default="1">
     <w:name w:val="Default Paragraph Font"/>
     <w:next w:val="Default Paragraph Font"/>
   </w:style>
@@ -5095,7 +5125,7 @@
       <w:u w:val="single"/>
     </w:rPr>
   </w:style>
-  <w:style w:type="table" w:default="1" w:styleId="Table Normal">
+  <w:style w:type="table" w:styleId="Table Normal" w:default="1">
     <w:name w:val="Table Normal"/>
     <w:next w:val="Table Normal"/>
     <w:pPr/>
@@ -5117,13 +5147,13 @@
     <w:tblStylePr w:type="seCell"/>
     <w:tblStylePr w:type="swCell"/>
   </w:style>
-  <w:style w:type="numbering" w:default="1" w:styleId="No List">
+  <w:style w:type="numbering" w:styleId="No List" w:default="1">
     <w:name w:val="No List"/>
     <w:next w:val="No List"/>
     <w:pPr/>
   </w:style>
   <w:style w:type="paragraph" w:styleId="Normal.0">
-    <w:name w:val="Normal"/>
+    <w:name w:val="Normal0"/>
     <w:next w:val="Normal.0"/>
     <w:pPr>
       <w:keepNext w:val="0"/>
@@ -5139,7 +5169,7 @@
       <w:outlineLvl w:val="9"/>
     </w:pPr>
     <w:rPr>
-      <w:rFonts w:ascii="Arial" w:cs="Arial Unicode MS" w:hAnsi="Arial" w:eastAsia="Arial Unicode MS"/>
+      <w:rFonts w:ascii="Arial" w:hAnsi="Arial" w:eastAsia="Arial Unicode MS" w:cs="Arial Unicode MS"/>
       <w:b w:val="0"/>
       <w:bCs w:val="0"/>
       <w:i w:val="0"/>
@@ -5190,7 +5220,7 @@
       <w:outlineLvl w:val="9"/>
     </w:pPr>
     <w:rPr>
-      <w:rFonts w:ascii="Helvetica Neue" w:cs="Helvetica Neue" w:hAnsi="Helvetica Neue" w:eastAsia="Helvetica Neue"/>
+      <w:rFonts w:ascii="Helvetica Neue" w:hAnsi="Helvetica Neue" w:eastAsia="Helvetica Neue" w:cs="Helvetica Neue"/>
       <w:b w:val="0"/>
       <w:bCs w:val="0"/>
       <w:i w:val="0"/>
@@ -5236,7 +5266,7 @@
       <w:outlineLvl w:val="9"/>
     </w:pPr>
     <w:rPr>
-      <w:rFonts w:ascii="Arial" w:cs="Arial Unicode MS" w:hAnsi="Arial" w:eastAsia="Arial Unicode MS"/>
+      <w:rFonts w:ascii="Arial" w:hAnsi="Arial" w:eastAsia="Arial Unicode MS" w:cs="Arial Unicode MS"/>
       <w:b w:val="0"/>
       <w:bCs w:val="0"/>
       <w:i w:val="0"/>
@@ -5280,7 +5310,7 @@
       <w:outlineLvl w:val="1"/>
     </w:pPr>
     <w:rPr>
-      <w:rFonts w:ascii="Arial" w:cs="Arial Unicode MS" w:hAnsi="Arial" w:eastAsia="Arial Unicode MS"/>
+      <w:rFonts w:ascii="Arial" w:hAnsi="Arial" w:eastAsia="Arial Unicode MS" w:cs="Arial Unicode MS"/>
       <w:b w:val="0"/>
       <w:bCs w:val="0"/>
       <w:i w:val="0"/>
@@ -5324,7 +5354,7 @@
       <w:outlineLvl w:val="9"/>
     </w:pPr>
     <w:rPr>
-      <w:rFonts w:ascii="Arial" w:cs="Arial Unicode MS" w:hAnsi="Arial" w:eastAsia="Arial Unicode MS"/>
+      <w:rFonts w:ascii="Arial" w:hAnsi="Arial" w:eastAsia="Arial Unicode MS" w:cs="Arial Unicode MS"/>
       <w:b w:val="0"/>
       <w:bCs w:val="0"/>
       <w:i w:val="0"/>
@@ -5359,7 +5389,7 @@
     <w:basedOn w:val="None"/>
     <w:next w:val="Hyperlink.0"/>
     <w:rPr>
-      <w:rFonts w:ascii="Arial" w:cs="Arial" w:hAnsi="Arial" w:eastAsia="Arial"/>
+      <w:rFonts w:ascii="Arial" w:hAnsi="Arial" w:eastAsia="Arial" w:cs="Arial"/>
       <w:outline w:val="0"/>
       <w:color w:val="0563c1"/>
       <w:u w:val="single" w:color="0563c1"/>
@@ -5389,7 +5419,7 @@
       <w:outlineLvl w:val="9"/>
     </w:pPr>
     <w:rPr>
-      <w:rFonts w:ascii="Arial" w:cs="Arial Unicode MS" w:hAnsi="Arial" w:eastAsia="Arial Unicode MS"/>
+      <w:rFonts w:ascii="Arial" w:hAnsi="Arial" w:eastAsia="Arial Unicode MS" w:cs="Arial Unicode MS"/>
       <w:b w:val="1"/>
       <w:bCs w:val="1"/>
       <w:i w:val="0"/>
@@ -5433,7 +5463,7 @@
       <w:outlineLvl w:val="0"/>
     </w:pPr>
     <w:rPr>
-      <w:rFonts w:ascii="Arial" w:cs="Arial Unicode MS" w:hAnsi="Arial" w:eastAsia="Arial Unicode MS"/>
+      <w:rFonts w:ascii="Arial" w:hAnsi="Arial" w:eastAsia="Arial Unicode MS" w:cs="Arial Unicode MS"/>
       <w:b w:val="0"/>
       <w:bCs w:val="0"/>
       <w:i w:val="0"/>
@@ -5483,7 +5513,7 @@
       <w:outlineLvl w:val="9"/>
     </w:pPr>
     <w:rPr>
-      <w:rFonts w:ascii="Arial" w:cs="Arial Unicode MS" w:hAnsi="Arial" w:eastAsia="Arial Unicode MS"/>
+      <w:rFonts w:ascii="Arial" w:hAnsi="Arial" w:eastAsia="Arial Unicode MS" w:cs="Arial Unicode MS"/>
       <w:b w:val="0"/>
       <w:bCs w:val="0"/>
       <w:i w:val="0"/>
@@ -5527,7 +5557,7 @@
       <w:outlineLvl w:val="9"/>
     </w:pPr>
     <w:rPr>
-      <w:rFonts w:ascii="Arial" w:cs="Arial Unicode MS" w:hAnsi="Arial" w:eastAsia="Arial Unicode MS"/>
+      <w:rFonts w:ascii="Arial" w:hAnsi="Arial" w:eastAsia="Arial Unicode MS" w:cs="Arial Unicode MS"/>
       <w:b w:val="0"/>
       <w:bCs w:val="0"/>
       <w:i w:val="0"/>
@@ -5571,7 +5601,7 @@
       <w:outlineLvl w:val="9"/>
     </w:pPr>
     <w:rPr>
-      <w:rFonts w:ascii="Arial" w:cs="Arial Unicode MS" w:hAnsi="Arial" w:eastAsia="Arial Unicode MS"/>
+      <w:rFonts w:ascii="Arial" w:hAnsi="Arial" w:eastAsia="Arial Unicode MS" w:cs="Arial Unicode MS"/>
       <w:b w:val="0"/>
       <w:bCs w:val="0"/>
       <w:i w:val="0"/>
@@ -5846,7 +5876,7 @@
           <a:buFontTx/>
           <a:buNone/>
           <a:tabLst/>
-          <a:defRPr b="0" baseline="0" cap="none" i="0" spc="0" strike="noStrike" sz="1800" u="none" kumimoji="0" normalizeH="0">
+          <a:defRPr kumimoji="0" sz="1800" b="0" i="0" u="none" strike="noStrike" cap="none" spc="0" normalizeH="0" baseline="0">
             <a:ln>
               <a:noFill/>
             </a:ln>
@@ -5876,7 +5906,7 @@
           <a:buFontTx/>
           <a:buNone/>
           <a:tabLst/>
-          <a:defRPr b="0" baseline="0" cap="none" i="0" spc="0" strike="noStrike" sz="1800" u="none" kumimoji="0" normalizeH="0">
+          <a:defRPr kumimoji="0" sz="1800" b="0" i="0" u="none" strike="noStrike" cap="none" spc="0" normalizeH="0" baseline="0">
             <a:ln>
               <a:noFill/>
             </a:ln>
@@ -5902,7 +5932,7 @@
           <a:buFontTx/>
           <a:buNone/>
           <a:tabLst/>
-          <a:defRPr b="0" baseline="0" cap="none" i="0" spc="0" strike="noStrike" sz="1800" u="none" kumimoji="0" normalizeH="0">
+          <a:defRPr kumimoji="0" sz="1800" b="0" i="0" u="none" strike="noStrike" cap="none" spc="0" normalizeH="0" baseline="0">
             <a:ln>
               <a:noFill/>
             </a:ln>
@@ -5928,7 +5958,7 @@
           <a:buFontTx/>
           <a:buNone/>
           <a:tabLst/>
-          <a:defRPr b="0" baseline="0" cap="none" i="0" spc="0" strike="noStrike" sz="1800" u="none" kumimoji="0" normalizeH="0">
+          <a:defRPr kumimoji="0" sz="1800" b="0" i="0" u="none" strike="noStrike" cap="none" spc="0" normalizeH="0" baseline="0">
             <a:ln>
               <a:noFill/>
             </a:ln>
@@ -5954,7 +5984,7 @@
           <a:buFontTx/>
           <a:buNone/>
           <a:tabLst/>
-          <a:defRPr b="0" baseline="0" cap="none" i="0" spc="0" strike="noStrike" sz="1800" u="none" kumimoji="0" normalizeH="0">
+          <a:defRPr kumimoji="0" sz="1800" b="0" i="0" u="none" strike="noStrike" cap="none" spc="0" normalizeH="0" baseline="0">
             <a:ln>
               <a:noFill/>
             </a:ln>
@@ -5980,7 +6010,7 @@
           <a:buFontTx/>
           <a:buNone/>
           <a:tabLst/>
-          <a:defRPr b="0" baseline="0" cap="none" i="0" spc="0" strike="noStrike" sz="1800" u="none" kumimoji="0" normalizeH="0">
+          <a:defRPr kumimoji="0" sz="1800" b="0" i="0" u="none" strike="noStrike" cap="none" spc="0" normalizeH="0" baseline="0">
             <a:ln>
               <a:noFill/>
             </a:ln>
@@ -6006,7 +6036,7 @@
           <a:buFontTx/>
           <a:buNone/>
           <a:tabLst/>
-          <a:defRPr b="0" baseline="0" cap="none" i="0" spc="0" strike="noStrike" sz="1800" u="none" kumimoji="0" normalizeH="0">
+          <a:defRPr kumimoji="0" sz="1800" b="0" i="0" u="none" strike="noStrike" cap="none" spc="0" normalizeH="0" baseline="0">
             <a:ln>
               <a:noFill/>
             </a:ln>
@@ -6032,7 +6062,7 @@
           <a:buFontTx/>
           <a:buNone/>
           <a:tabLst/>
-          <a:defRPr b="0" baseline="0" cap="none" i="0" spc="0" strike="noStrike" sz="1800" u="none" kumimoji="0" normalizeH="0">
+          <a:defRPr kumimoji="0" sz="1800" b="0" i="0" u="none" strike="noStrike" cap="none" spc="0" normalizeH="0" baseline="0">
             <a:ln>
               <a:noFill/>
             </a:ln>
@@ -6058,7 +6088,7 @@
           <a:buFontTx/>
           <a:buNone/>
           <a:tabLst/>
-          <a:defRPr b="0" baseline="0" cap="none" i="0" spc="0" strike="noStrike" sz="1800" u="none" kumimoji="0" normalizeH="0">
+          <a:defRPr kumimoji="0" sz="1800" b="0" i="0" u="none" strike="noStrike" cap="none" spc="0" normalizeH="0" baseline="0">
             <a:ln>
               <a:noFill/>
             </a:ln>
@@ -6084,7 +6114,7 @@
           <a:buFontTx/>
           <a:buNone/>
           <a:tabLst/>
-          <a:defRPr b="0" baseline="0" cap="none" i="0" spc="0" strike="noStrike" sz="1800" u="none" kumimoji="0" normalizeH="0">
+          <a:defRPr kumimoji="0" sz="1800" b="0" i="0" u="none" strike="noStrike" cap="none" spc="0" normalizeH="0" baseline="0">
             <a:ln>
               <a:noFill/>
             </a:ln>
@@ -6135,7 +6165,7 @@
           <a:buFontTx/>
           <a:buNone/>
           <a:tabLst/>
-          <a:defRPr b="0" baseline="0" cap="none" i="0" spc="0" strike="noStrike" sz="1800" u="none" kumimoji="0" normalizeH="0">
+          <a:defRPr kumimoji="0" sz="1800" b="0" i="0" u="none" strike="noStrike" cap="none" spc="0" normalizeH="0" baseline="0">
             <a:ln>
               <a:noFill/>
             </a:ln>
@@ -6161,7 +6191,7 @@
           <a:buFontTx/>
           <a:buNone/>
           <a:tabLst/>
-          <a:defRPr b="0" baseline="0" cap="none" i="0" spc="0" strike="noStrike" sz="1800" u="none" kumimoji="0" normalizeH="0">
+          <a:defRPr kumimoji="0" sz="1800" b="0" i="0" u="none" strike="noStrike" cap="none" spc="0" normalizeH="0" baseline="0">
             <a:ln>
               <a:noFill/>
             </a:ln>
@@ -6187,7 +6217,7 @@
           <a:buFontTx/>
           <a:buNone/>
           <a:tabLst/>
-          <a:defRPr b="0" baseline="0" cap="none" i="0" spc="0" strike="noStrike" sz="1800" u="none" kumimoji="0" normalizeH="0">
+          <a:defRPr kumimoji="0" sz="1800" b="0" i="0" u="none" strike="noStrike" cap="none" spc="0" normalizeH="0" baseline="0">
             <a:ln>
               <a:noFill/>
             </a:ln>
@@ -6213,7 +6243,7 @@
           <a:buFontTx/>
           <a:buNone/>
           <a:tabLst/>
-          <a:defRPr b="0" baseline="0" cap="none" i="0" spc="0" strike="noStrike" sz="1800" u="none" kumimoji="0" normalizeH="0">
+          <a:defRPr kumimoji="0" sz="1800" b="0" i="0" u="none" strike="noStrike" cap="none" spc="0" normalizeH="0" baseline="0">
             <a:ln>
               <a:noFill/>
             </a:ln>
@@ -6239,7 +6269,7 @@
           <a:buFontTx/>
           <a:buNone/>
           <a:tabLst/>
-          <a:defRPr b="0" baseline="0" cap="none" i="0" spc="0" strike="noStrike" sz="1800" u="none" kumimoji="0" normalizeH="0">
+          <a:defRPr kumimoji="0" sz="1800" b="0" i="0" u="none" strike="noStrike" cap="none" spc="0" normalizeH="0" baseline="0">
             <a:ln>
               <a:noFill/>
             </a:ln>
@@ -6265,7 +6295,7 @@
           <a:buFontTx/>
           <a:buNone/>
           <a:tabLst/>
-          <a:defRPr b="0" baseline="0" cap="none" i="0" spc="0" strike="noStrike" sz="1800" u="none" kumimoji="0" normalizeH="0">
+          <a:defRPr kumimoji="0" sz="1800" b="0" i="0" u="none" strike="noStrike" cap="none" spc="0" normalizeH="0" baseline="0">
             <a:ln>
               <a:noFill/>
             </a:ln>
@@ -6291,7 +6321,7 @@
           <a:buFontTx/>
           <a:buNone/>
           <a:tabLst/>
-          <a:defRPr b="0" baseline="0" cap="none" i="0" spc="0" strike="noStrike" sz="1800" u="none" kumimoji="0" normalizeH="0">
+          <a:defRPr kumimoji="0" sz="1800" b="0" i="0" u="none" strike="noStrike" cap="none" spc="0" normalizeH="0" baseline="0">
             <a:ln>
               <a:noFill/>
             </a:ln>
@@ -6317,7 +6347,7 @@
           <a:buFontTx/>
           <a:buNone/>
           <a:tabLst/>
-          <a:defRPr b="0" baseline="0" cap="none" i="0" spc="0" strike="noStrike" sz="1800" u="none" kumimoji="0" normalizeH="0">
+          <a:defRPr kumimoji="0" sz="1800" b="0" i="0" u="none" strike="noStrike" cap="none" spc="0" normalizeH="0" baseline="0">
             <a:ln>
               <a:noFill/>
             </a:ln>
@@ -6343,7 +6373,7 @@
           <a:buFontTx/>
           <a:buNone/>
           <a:tabLst/>
-          <a:defRPr b="0" baseline="0" cap="none" i="0" spc="0" strike="noStrike" sz="1800" u="none" kumimoji="0" normalizeH="0">
+          <a:defRPr kumimoji="0" sz="1800" b="0" i="0" u="none" strike="noStrike" cap="none" spc="0" normalizeH="0" baseline="0">
             <a:ln>
               <a:noFill/>
             </a:ln>
@@ -6369,7 +6399,7 @@
           <a:buFontTx/>
           <a:buNone/>
           <a:tabLst/>
-          <a:defRPr b="0" baseline="0" cap="none" i="0" spc="0" strike="noStrike" sz="1800" u="none" kumimoji="0" normalizeH="0">
+          <a:defRPr kumimoji="0" sz="1800" b="0" i="0" u="none" strike="noStrike" cap="none" spc="0" normalizeH="0" baseline="0">
             <a:ln>
               <a:noFill/>
             </a:ln>
@@ -6417,7 +6447,7 @@
           <a:buFontTx/>
           <a:buNone/>
           <a:tabLst/>
-          <a:defRPr b="0" baseline="0" cap="none" i="0" spc="0" strike="noStrike" sz="1800" u="none" kumimoji="0" normalizeH="0">
+          <a:defRPr kumimoji="0" sz="1800" b="0" i="0" u="none" strike="noStrike" cap="none" spc="0" normalizeH="0" baseline="0">
             <a:ln>
               <a:noFill/>
             </a:ln>
@@ -6447,7 +6477,7 @@
           <a:buFontTx/>
           <a:buNone/>
           <a:tabLst/>
-          <a:defRPr b="0" baseline="0" cap="none" i="0" spc="0" strike="noStrike" sz="1800" u="none" kumimoji="0" normalizeH="0">
+          <a:defRPr kumimoji="0" sz="1800" b="0" i="0" u="none" strike="noStrike" cap="none" spc="0" normalizeH="0" baseline="0">
             <a:ln>
               <a:noFill/>
             </a:ln>
@@ -6473,7 +6503,7 @@
           <a:buFontTx/>
           <a:buNone/>
           <a:tabLst/>
-          <a:defRPr b="0" baseline="0" cap="none" i="0" spc="0" strike="noStrike" sz="1800" u="none" kumimoji="0" normalizeH="0">
+          <a:defRPr kumimoji="0" sz="1800" b="0" i="0" u="none" strike="noStrike" cap="none" spc="0" normalizeH="0" baseline="0">
             <a:ln>
               <a:noFill/>
             </a:ln>
@@ -6499,7 +6529,7 @@
           <a:buFontTx/>
           <a:buNone/>
           <a:tabLst/>
-          <a:defRPr b="0" baseline="0" cap="none" i="0" spc="0" strike="noStrike" sz="1800" u="none" kumimoji="0" normalizeH="0">
+          <a:defRPr kumimoji="0" sz="1800" b="0" i="0" u="none" strike="noStrike" cap="none" spc="0" normalizeH="0" baseline="0">
             <a:ln>
               <a:noFill/>
             </a:ln>
@@ -6525,7 +6555,7 @@
           <a:buFontTx/>
           <a:buNone/>
           <a:tabLst/>
-          <a:defRPr b="0" baseline="0" cap="none" i="0" spc="0" strike="noStrike" sz="1800" u="none" kumimoji="0" normalizeH="0">
+          <a:defRPr kumimoji="0" sz="1800" b="0" i="0" u="none" strike="noStrike" cap="none" spc="0" normalizeH="0" baseline="0">
             <a:ln>
               <a:noFill/>
             </a:ln>
@@ -6551,7 +6581,7 @@
           <a:buFontTx/>
           <a:buNone/>
           <a:tabLst/>
-          <a:defRPr b="0" baseline="0" cap="none" i="0" spc="0" strike="noStrike" sz="1800" u="none" kumimoji="0" normalizeH="0">
+          <a:defRPr kumimoji="0" sz="1800" b="0" i="0" u="none" strike="noStrike" cap="none" spc="0" normalizeH="0" baseline="0">
             <a:ln>
               <a:noFill/>
             </a:ln>
@@ -6577,7 +6607,7 @@
           <a:buFontTx/>
           <a:buNone/>
           <a:tabLst/>
-          <a:defRPr b="0" baseline="0" cap="none" i="0" spc="0" strike="noStrike" sz="1800" u="none" kumimoji="0" normalizeH="0">
+          <a:defRPr kumimoji="0" sz="1800" b="0" i="0" u="none" strike="noStrike" cap="none" spc="0" normalizeH="0" baseline="0">
             <a:ln>
               <a:noFill/>
             </a:ln>
@@ -6603,7 +6633,7 @@
           <a:buFontTx/>
           <a:buNone/>
           <a:tabLst/>
-          <a:defRPr b="0" baseline="0" cap="none" i="0" spc="0" strike="noStrike" sz="1800" u="none" kumimoji="0" normalizeH="0">
+          <a:defRPr kumimoji="0" sz="1800" b="0" i="0" u="none" strike="noStrike" cap="none" spc="0" normalizeH="0" baseline="0">
             <a:ln>
               <a:noFill/>
             </a:ln>
@@ -6629,7 +6659,7 @@
           <a:buFontTx/>
           <a:buNone/>
           <a:tabLst/>
-          <a:defRPr b="0" baseline="0" cap="none" i="0" spc="0" strike="noStrike" sz="1800" u="none" kumimoji="0" normalizeH="0">
+          <a:defRPr kumimoji="0" sz="1800" b="0" i="0" u="none" strike="noStrike" cap="none" spc="0" normalizeH="0" baseline="0">
             <a:ln>
               <a:noFill/>
             </a:ln>
@@ -6655,7 +6685,7 @@
           <a:buFontTx/>
           <a:buNone/>
           <a:tabLst/>
-          <a:defRPr b="0" baseline="0" cap="none" i="0" spc="0" strike="noStrike" sz="1800" u="none" kumimoji="0" normalizeH="0">
+          <a:defRPr kumimoji="0" sz="1800" b="0" i="0" u="none" strike="noStrike" cap="none" spc="0" normalizeH="0" baseline="0">
             <a:ln>
               <a:noFill/>
             </a:ln>

</xml_diff>

<commit_message>
Deploying to gh-pages from @ digitalservicebund/digitalcheck-dito@82e4424add4dd477a5d161291b4b909d9816f788 🚀
</commit_message>
<xml_diff>
--- a/documents/VORLAGE_Dokumentation_der_Digitaltauglichkeit_V2.docx
+++ b/documents/VORLAGE_Dokumentation_der_Digitaltauglichkeit_V2.docx
@@ -65,6 +65,7 @@
             <w:pPr>
               <w:pStyle w:val="Heading2"/>
               <w:spacing w:before="360" w:after="120"/>
+              <w:ind w:hanging="0" w:start="0" w:end="0"/>
               <w:rPr>
                 <w:shd w:fill="auto" w:val="clear"/>
               </w:rPr>
@@ -82,7 +83,7 @@
               <w:pStyle w:val="ListParagraph"/>
               <w:numPr>
                 <w:ilvl w:val="0"/>
-                <w:numId w:val="2"/>
+                <w:numId w:val="1"/>
               </w:numPr>
               <w:bidi w:val="0"/>
               <w:spacing w:before="180" w:after="0"/>
@@ -105,7 +106,7 @@
               <w:pStyle w:val="ListParagraph"/>
               <w:numPr>
                 <w:ilvl w:val="0"/>
-                <w:numId w:val="2"/>
+                <w:numId w:val="1"/>
               </w:numPr>
               <w:bidi w:val="0"/>
               <w:spacing w:before="0" w:after="120"/>
@@ -128,7 +129,7 @@
               <w:pStyle w:val="ListParagraph"/>
               <w:numPr>
                 <w:ilvl w:val="1"/>
-                <w:numId w:val="3"/>
+                <w:numId w:val="2"/>
               </w:numPr>
               <w:bidi w:val="0"/>
               <w:spacing w:before="180" w:after="0"/>
@@ -165,7 +166,7 @@
               <w:r>
                 <w:rPr>
                   <w:rStyle w:val="Style7"/>
-                  <w:rFonts w:ascii="Arial" w:hAnsi="Arial" w:eastAsia="Arial" w:cs="Arial"/>
+                  <w:rFonts w:eastAsia="Arial" w:cs="Arial"/>
                   <w:outline w:val="false"/>
                   <w:color w:val="0563C1"/>
                   <w:u w:val="single" w:color="0563C1"/>
@@ -189,7 +190,7 @@
               <w:pStyle w:val="ListParagraph"/>
               <w:numPr>
                 <w:ilvl w:val="1"/>
-                <w:numId w:val="3"/>
+                <w:numId w:val="2"/>
               </w:numPr>
               <w:bidi w:val="0"/>
               <w:spacing w:before="0" w:after="0"/>
@@ -229,7 +230,7 @@
               <w:r>
                 <w:rPr>
                   <w:rStyle w:val="Style7"/>
-                  <w:rFonts w:ascii="Arial" w:hAnsi="Arial" w:eastAsia="Arial" w:cs="Arial"/>
+                  <w:rFonts w:eastAsia="Arial" w:cs="Arial"/>
                   <w:outline w:val="false"/>
                   <w:color w:val="0563C1"/>
                   <w:u w:val="single" w:color="0563C1"/>
@@ -253,7 +254,7 @@
               <w:pStyle w:val="ListParagraph"/>
               <w:numPr>
                 <w:ilvl w:val="1"/>
-                <w:numId w:val="3"/>
+                <w:numId w:val="2"/>
               </w:numPr>
               <w:bidi w:val="0"/>
               <w:spacing w:before="0" w:after="120"/>
@@ -293,6 +294,7 @@
             <w:pPr>
               <w:pStyle w:val="Heading2"/>
               <w:spacing w:lineRule="auto" w:line="276" w:before="360" w:after="120"/>
+              <w:ind w:hanging="0" w:start="0" w:end="0"/>
               <w:rPr>
                 <w:shd w:fill="auto" w:val="clear"/>
               </w:rPr>
@@ -543,6 +545,7 @@
       <w:pPr>
         <w:pStyle w:val="Heading1"/>
         <w:spacing w:before="720" w:after="120"/>
+        <w:ind w:hanging="0" w:start="0" w:end="0"/>
         <w:rPr>
           <w:b/>
           <w:bCs/>
@@ -575,6 +578,7 @@
       <w:pPr>
         <w:pStyle w:val="Heading1"/>
         <w:spacing w:before="600" w:after="120"/>
+        <w:ind w:hanging="0" w:start="0" w:end="0"/>
         <w:rPr>
           <w:b/>
           <w:bCs/>
@@ -616,6 +620,7 @@
     <w:p>
       <w:pPr>
         <w:pStyle w:val="Heading2"/>
+        <w:ind w:hanging="0" w:start="0" w:end="0"/>
         <w:rPr/>
       </w:pPr>
       <w:r>
@@ -648,6 +653,7 @@
     <w:p>
       <w:pPr>
         <w:pStyle w:val="Heading2"/>
+        <w:ind w:hanging="0" w:start="0" w:end="0"/>
         <w:rPr/>
       </w:pPr>
       <w:r>
@@ -737,6 +743,7 @@
     <w:p>
       <w:pPr>
         <w:pStyle w:val="Heading2"/>
+        <w:ind w:hanging="0" w:start="0" w:end="0"/>
         <w:rPr/>
       </w:pPr>
       <w:r>
@@ -964,6 +971,7 @@
     <w:p>
       <w:pPr>
         <w:pStyle w:val="Heading2"/>
+        <w:ind w:hanging="0" w:start="0" w:end="0"/>
         <w:rPr/>
       </w:pPr>
       <w:r>
@@ -1184,6 +1192,7 @@
     <w:p>
       <w:pPr>
         <w:pStyle w:val="Heading2"/>
+        <w:ind w:hanging="0" w:start="0" w:end="0"/>
         <w:rPr/>
       </w:pPr>
       <w:r>
@@ -1404,6 +1413,7 @@
     <w:p>
       <w:pPr>
         <w:pStyle w:val="Heading2"/>
+        <w:ind w:hanging="0" w:start="0" w:end="0"/>
         <w:rPr/>
       </w:pPr>
       <w:r>
@@ -1623,6 +1633,7 @@
     <w:p>
       <w:pPr>
         <w:pStyle w:val="Heading2"/>
+        <w:ind w:hanging="0" w:start="0" w:end="0"/>
         <w:rPr/>
       </w:pPr>
       <w:r>
@@ -1797,6 +1808,7 @@
       <w:pPr>
         <w:pStyle w:val="Heading1"/>
         <w:spacing w:before="720" w:after="120"/>
+        <w:ind w:hanging="0" w:start="0" w:end="0"/>
         <w:rPr>
           <w:b/>
           <w:bCs/>
@@ -1817,7 +1829,7 @@
         <w:pStyle w:val="ListParagraph"/>
         <w:numPr>
           <w:ilvl w:val="0"/>
-          <w:numId w:val="4"/>
+          <w:numId w:val="3"/>
         </w:numPr>
         <w:bidi w:val="0"/>
         <w:spacing w:before="180" w:after="0"/>
@@ -1858,7 +1870,7 @@
         <w:pStyle w:val="ListParagraph"/>
         <w:numPr>
           <w:ilvl w:val="0"/>
-          <w:numId w:val="4"/>
+          <w:numId w:val="3"/>
         </w:numPr>
         <w:bidi w:val="0"/>
         <w:spacing w:before="0" w:after="0"/>
@@ -1909,7 +1921,7 @@
         <w:pStyle w:val="ListParagraph"/>
         <w:numPr>
           <w:ilvl w:val="0"/>
-          <w:numId w:val="4"/>
+          <w:numId w:val="3"/>
         </w:numPr>
         <w:bidi w:val="0"/>
         <w:spacing w:before="0" w:after="0"/>
@@ -1960,7 +1972,7 @@
         <w:pStyle w:val="ListParagraph"/>
         <w:numPr>
           <w:ilvl w:val="0"/>
-          <w:numId w:val="4"/>
+          <w:numId w:val="3"/>
         </w:numPr>
         <w:bidi w:val="0"/>
         <w:spacing w:before="0" w:after="0"/>
@@ -1992,7 +2004,7 @@
         <w:pStyle w:val="ListParagraph"/>
         <w:numPr>
           <w:ilvl w:val="0"/>
-          <w:numId w:val="4"/>
+          <w:numId w:val="3"/>
         </w:numPr>
         <w:bidi w:val="0"/>
         <w:spacing w:before="0" w:after="120"/>
@@ -2013,6 +2025,7 @@
     <w:p>
       <w:pPr>
         <w:pStyle w:val="Heading2"/>
+        <w:ind w:hanging="0" w:start="0" w:end="0"/>
         <w:rPr/>
       </w:pPr>
       <w:r>
@@ -2033,12 +2046,13 @@
           <w:rStyle w:val="None"/>
           <w:lang w:val="de-DE"/>
         </w:rPr>
-        <w:t>Der NKR prüft das Regelungsvorhaben auf Möglichkeiten der digitalen Umsetzung. Die Basis ist der von Ihnen durchgeführte Digitalcheck. Das wesentliche Prüfkriterium ist die methodische und inhaltliche Nachvollziehbarkeit. Sein Prüfergebnis veröffentlicht er gegebenenfalls in seinen Stellungnahmen. Wenn Sie eine Visualisierung angefertigt haben und Sie der Veröffentlichung zustimmen, kann diese an die Stellungnahme angehängt werden. Bei Fragen oder Anregungen kommt Ihre Ansprechperson im NKR-Sekretariat auf Sie zu.</w:t>
+        <w:t>Der NKR prüft das Regelung---svorhaben auf Möglichkeiten der digitalen Umsetzung. Die Basis ist der von Ihnen durchgeführte Digitalcheck. Das wesentliche Prüfkriterium ist die methodische und inhaltliche Nachvollziehbarkeit. Sein Prüfergebnis veröffentlicht er gegebenenfalls in seinen Stellungnahmen. Wenn Sie eine Visualisierung angefertigt haben und Sie der Veröffentlichung zustimmen, kann diese an die Stellungnahme angehängt werden. Bei Fragen oder Anregungen kommt Ihre Ansprechperson im NKR-Sekretariat auf Sie zu.</w:t>
       </w:r>
     </w:p>
     <w:p>
       <w:pPr>
         <w:pStyle w:val="Heading2"/>
+        <w:ind w:hanging="0" w:start="0" w:end="0"/>
         <w:rPr/>
       </w:pPr>
       <w:r>
@@ -2079,197 +2093,79 @@
         </w:rPr>
         <w:t>.</w:t>
       </w:r>
-      <w:r>
-        <w:br w:type="page"/>
-      </w:r>
-    </w:p>
-    <w:p>
-      <w:pPr>
-        <w:pStyle w:val="Heading1"/>
-        <w:rPr/>
-      </w:pPr>
-      <w:r>
-        <w:rPr>
-          <w:rStyle w:val="None"/>
-        </w:rPr>
-        <w:t>Anhang 1: EU-Interoperabilität</w:t>
-      </w:r>
     </w:p>
     <w:p>
       <w:pPr>
         <w:pStyle w:val="Normal0"/>
-        <w:rPr/>
-      </w:pPr>
-      <w:r>
-        <w:rPr>
-          <w:rStyle w:val="None"/>
-        </w:rPr>
-        <w:t xml:space="preserve">Betroffene transeuropäische Dienste: </w:t>
-      </w:r>
-      <w:bookmarkStart w:id="5" w:name="AFFECTED_SERVICES"/>
-      <w:r>
-        <w:rPr/>
-        <w:t>{{AFFECTED_SERVICES}}</w:t>
-      </w:r>
-      <w:bookmarkEnd w:id="5"/>
-    </w:p>
-    <w:p>
-      <w:pPr>
-        <w:pStyle w:val="Normal0"/>
-        <w:rPr/>
-      </w:pPr>
-      <w:r>
-        <w:rPr/>
-        <w:t xml:space="preserve">Betroffene Bereiche: </w:t>
-      </w:r>
-      <w:bookmarkStart w:id="6" w:name="AFFECTED_AREAS"/>
-      <w:r>
-        <w:rPr/>
-        <w:t>{{AFFECTED_AREAS}}</w:t>
-      </w:r>
-      <w:bookmarkEnd w:id="6"/>
-    </w:p>
-    <w:p>
-      <w:pPr>
-        <w:pStyle w:val="Normal0"/>
-        <w:rPr/>
-      </w:pPr>
-      <w:r>
-        <w:rPr/>
-        <w:t xml:space="preserve">Verbindliche Anforderungen: </w:t>
-      </w:r>
-      <w:bookmarkStart w:id="7" w:name="BINDING_REQUIREMENTS"/>
-      <w:r>
-        <w:rPr/>
-        <w:t>{{BINDING_REQUIREMENTS}}</w:t>
-      </w:r>
-      <w:bookmarkEnd w:id="7"/>
-    </w:p>
-    <w:p>
-      <w:pPr>
-        <w:pStyle w:val="Normal0"/>
-        <w:rPr/>
-      </w:pPr>
-      <w:r>
-        <w:rPr/>
-        <w:t xml:space="preserve">Betroffene Gruppen: </w:t>
-      </w:r>
-      <w:bookmarkStart w:id="8" w:name="affected_stakeholders"/>
-      <w:r>
-        <w:rPr/>
-        <w:t>{{AFFECTED_STAKEHOLDERS}}</w:t>
-      </w:r>
-      <w:bookmarkEnd w:id="8"/>
-    </w:p>
-    <w:p>
-      <w:pPr>
-        <w:pStyle w:val="Normal0"/>
-        <w:rPr/>
-      </w:pPr>
-      <w:r>
-        <w:rPr/>
-        <w:t>Einordnung</w:t>
-      </w:r>
-    </w:p>
-    <w:p>
-      <w:pPr>
-        <w:pStyle w:val="Heading2"/>
-        <w:rPr/>
-      </w:pPr>
-      <w:r>
-        <w:rPr/>
-        <w:t>Rechtliche Interoperabilität</w:t>
-      </w:r>
-    </w:p>
-    <w:p>
-      <w:pPr>
-        <w:pStyle w:val="Normal0"/>
-        <w:rPr/>
-      </w:pPr>
-      <w:bookmarkStart w:id="9" w:name="INTEROPERABILITY_LEGAL_TEXT"/>
-      <w:r>
-        <w:rPr/>
-        <w:t>{{INTEROPERABILITY_LEGAL_TEXT}}</w:t>
-      </w:r>
-      <w:bookmarkEnd w:id="9"/>
-    </w:p>
-    <w:p>
-      <w:pPr>
-        <w:pStyle w:val="Normal0"/>
-        <w:rPr/>
-      </w:pPr>
-      <w:r>
-        <w:rPr/>
-        <w:t xml:space="preserve">Bewertung der rechtlichen Interoperabilität: </w:t>
-      </w:r>
-      <w:bookmarkStart w:id="10" w:name="INTEROPERABILITY_LEGAL_EVALUATION"/>
-      <w:r>
-        <w:rPr>
-          <w:b/>
-          <w:bCs/>
-        </w:rPr>
-        <w:t>{{INTEROPERABILITY_LEGAL_EVALUATION}}</w:t>
-      </w:r>
-      <w:bookmarkEnd w:id="10"/>
-    </w:p>
-    <w:p>
-      <w:pPr>
-        <w:pStyle w:val="Heading2"/>
-        <w:rPr/>
-      </w:pPr>
-      <w:r>
-        <w:rPr/>
-        <w:t>Organisatorische Interoperabilität</w:t>
-      </w:r>
-    </w:p>
-    <w:p>
-      <w:pPr>
-        <w:pStyle w:val="Normal0"/>
-        <w:rPr/>
-      </w:pPr>
-      <w:bookmarkStart w:id="11" w:name="INTEROPERABILITY_ORGANIZATIONAL_TEXT"/>
-      <w:r>
-        <w:rPr/>
-        <w:t>{{INTEROPERABILITY_ORGANIZATIONAL_TEXT}}</w:t>
-      </w:r>
-      <w:bookmarkEnd w:id="11"/>
-    </w:p>
-    <w:p>
-      <w:pPr>
-        <w:pStyle w:val="Normal0"/>
-        <w:spacing w:before="180" w:after="120"/>
-        <w:rPr/>
-      </w:pPr>
-      <w:r>
-        <w:rPr/>
-        <w:t xml:space="preserve">Bewertung der rechtlichen Interoperabilität: </w:t>
-      </w:r>
-      <w:bookmarkStart w:id="12" w:name="INTEROPERABILITY_ORGANIZATIONAL_EVALUATI"/>
-      <w:r>
-        <w:rPr>
-          <w:b/>
-          <w:bCs/>
-        </w:rPr>
-        <w:t>{{INTEROPERABILITY_ORGANIZATIONAL_EVALUATION}}</w:t>
-      </w:r>
-      <w:bookmarkEnd w:id="12"/>
+        <w:keepNext w:val="false"/>
+        <w:keepLines w:val="false"/>
+        <w:pageBreakBefore w:val="false"/>
+        <w:widowControl/>
+        <w:suppressAutoHyphens w:val="false"/>
+        <w:overflowPunct w:val="false"/>
+        <w:bidi w:val="0"/>
+        <w:spacing w:lineRule="auto" w:line="300" w:before="180" w:after="120"/>
+        <w:ind w:hanging="0" w:start="0" w:end="0"/>
+        <w:jc w:val="start"/>
+        <w:rPr/>
+      </w:pPr>
+      <w:r>
+        <w:rPr>
+          <w:rStyle w:val="None"/>
+          <w:lang w:val="de-DE"/>
+        </w:rPr>
+        <w:t>{{APPENDICES}}</w:t>
+      </w:r>
     </w:p>
     <w:sectPr>
-      <w:headerReference w:type="default" r:id="rId7"/>
-      <w:footerReference w:type="default" r:id="rId8"/>
+      <w:headerReference w:type="even" r:id="rId7"/>
+      <w:headerReference w:type="default" r:id="rId8"/>
+      <w:headerReference w:type="first" r:id="rId9"/>
+      <w:footerReference w:type="even" r:id="rId10"/>
+      <w:footerReference w:type="default" r:id="rId11"/>
+      <w:footerReference w:type="first" r:id="rId12"/>
       <w:type w:val="nextPage"/>
       <w:pgSz w:w="11906" w:h="16838"/>
       <w:pgMar w:left="1440" w:right="1440" w:gutter="0" w:header="708" w:top="1440" w:footer="709" w:bottom="1440"/>
       <w:pgNumType w:fmt="decimal"/>
       <w:formProt w:val="false"/>
       <w:textDirection w:val="lrTb"/>
-      <w:docGrid w:type="default" w:linePitch="100" w:charSpace="0"/>
+      <w:docGrid w:type="default" w:linePitch="100" w:charSpace="8192"/>
     </w:sectPr>
   </w:body>
 </w:document>
 </file>
 
 <file path=word/footer1.xml><?xml version="1.0" encoding="utf-8"?>
+<w:ftr xmlns:o="urn:schemas-microsoft-com:office:office" xmlns:r="http://schemas.openxmlformats.org/officeDocument/2006/relationships" xmlns:v="urn:schemas-microsoft-com:vml" xmlns:w="http://schemas.openxmlformats.org/wordprocessingml/2006/main" xmlns:w10="urn:schemas-microsoft-com:office:word" xmlns:wp="http://schemas.openxmlformats.org/drawingml/2006/wordprocessingDrawing" xmlns:pic="http://schemas.openxmlformats.org/drawingml/2006/picture" xmlns:wps="http://schemas.microsoft.com/office/word/2010/wordprocessingShape" xmlns:wpg="http://schemas.microsoft.com/office/word/2010/wordprocessingGroup" xmlns:mc="http://schemas.openxmlformats.org/markup-compatibility/2006" xmlns:wp14="http://schemas.microsoft.com/office/word/2010/wordprocessingDrawing" xmlns:w14="http://schemas.microsoft.com/office/word/2010/wordml" xmlns:w15="http://schemas.microsoft.com/office/word/2012/wordml" mc:Ignorable="w14 wp14 w15">
+  <w:p>
+    <w:pPr>
+      <w:pStyle w:val="Footer"/>
+      <w:rPr/>
+    </w:pPr>
+    <w:r>
+      <w:rPr/>
+    </w:r>
+  </w:p>
+</w:ftr>
+</file>
+
+<file path=word/footer2.xml><?xml version="1.0" encoding="utf-8"?>
+<w:ftr xmlns:o="urn:schemas-microsoft-com:office:office" xmlns:r="http://schemas.openxmlformats.org/officeDocument/2006/relationships" xmlns:v="urn:schemas-microsoft-com:vml" xmlns:w="http://schemas.openxmlformats.org/wordprocessingml/2006/main" xmlns:w10="urn:schemas-microsoft-com:office:word" xmlns:wp="http://schemas.openxmlformats.org/drawingml/2006/wordprocessingDrawing" xmlns:pic="http://schemas.openxmlformats.org/drawingml/2006/picture" xmlns:wps="http://schemas.microsoft.com/office/word/2010/wordprocessingShape" xmlns:wpg="http://schemas.microsoft.com/office/word/2010/wordprocessingGroup" xmlns:mc="http://schemas.openxmlformats.org/markup-compatibility/2006" xmlns:wp14="http://schemas.microsoft.com/office/word/2010/wordprocessingDrawing" xmlns:w14="http://schemas.microsoft.com/office/word/2010/wordml" xmlns:w15="http://schemas.microsoft.com/office/word/2012/wordml" mc:Ignorable="w14 wp14 w15">
+  <w:p>
+    <w:pPr>
+      <w:pStyle w:val="HeaderFooter"/>
+      <w:bidi w:val="0"/>
+      <w:rPr/>
+    </w:pPr>
+    <w:r>
+      <w:rPr/>
+    </w:r>
+  </w:p>
+</w:ftr>
+</file>
+
+<file path=word/footer3.xml><?xml version="1.0" encoding="utf-8"?>
 <w:ftr xmlns:o="urn:schemas-microsoft-com:office:office" xmlns:r="http://schemas.openxmlformats.org/officeDocument/2006/relationships" xmlns:v="urn:schemas-microsoft-com:vml" xmlns:w="http://schemas.openxmlformats.org/wordprocessingml/2006/main" xmlns:w10="urn:schemas-microsoft-com:office:word" xmlns:wp="http://schemas.openxmlformats.org/drawingml/2006/wordprocessingDrawing" xmlns:pic="http://schemas.openxmlformats.org/drawingml/2006/picture" xmlns:wps="http://schemas.microsoft.com/office/word/2010/wordprocessingShape" xmlns:wpg="http://schemas.microsoft.com/office/word/2010/wordprocessingGroup" xmlns:mc="http://schemas.openxmlformats.org/markup-compatibility/2006" xmlns:wp14="http://schemas.microsoft.com/office/word/2010/wordprocessingDrawing" xmlns:w14="http://schemas.microsoft.com/office/word/2010/wordml" xmlns:w15="http://schemas.microsoft.com/office/word/2012/wordml" mc:Ignorable="w14 wp14 w15">
   <w:p>
     <w:pPr>
@@ -2285,6 +2181,20 @@
 </file>
 
 <file path=word/header1.xml><?xml version="1.0" encoding="utf-8"?>
+<w:hdr xmlns:o="urn:schemas-microsoft-com:office:office" xmlns:r="http://schemas.openxmlformats.org/officeDocument/2006/relationships" xmlns:v="urn:schemas-microsoft-com:vml" xmlns:w="http://schemas.openxmlformats.org/wordprocessingml/2006/main" xmlns:w10="urn:schemas-microsoft-com:office:word" xmlns:wp="http://schemas.openxmlformats.org/drawingml/2006/wordprocessingDrawing" xmlns:pic="http://schemas.openxmlformats.org/drawingml/2006/picture" xmlns:wps="http://schemas.microsoft.com/office/word/2010/wordprocessingShape" xmlns:wpg="http://schemas.microsoft.com/office/word/2010/wordprocessingGroup" xmlns:mc="http://schemas.openxmlformats.org/markup-compatibility/2006" xmlns:wp14="http://schemas.microsoft.com/office/word/2010/wordprocessingDrawing" xmlns:w14="http://schemas.microsoft.com/office/word/2010/wordml" xmlns:w15="http://schemas.microsoft.com/office/word/2012/wordml" mc:Ignorable="w14 wp14 w15">
+  <w:p>
+    <w:pPr>
+      <w:pStyle w:val="Header"/>
+      <w:rPr/>
+    </w:pPr>
+    <w:r>
+      <w:rPr/>
+    </w:r>
+  </w:p>
+</w:hdr>
+</file>
+
+<file path=word/header2.xml><?xml version="1.0" encoding="utf-8"?>
 <w:hdr xmlns:o="urn:schemas-microsoft-com:office:office" xmlns:r="http://schemas.openxmlformats.org/officeDocument/2006/relationships" xmlns:v="urn:schemas-microsoft-com:vml" xmlns:w="http://schemas.openxmlformats.org/wordprocessingml/2006/main" xmlns:w10="urn:schemas-microsoft-com:office:word" xmlns:wp="http://schemas.openxmlformats.org/drawingml/2006/wordprocessingDrawing" xmlns:pic="http://schemas.openxmlformats.org/drawingml/2006/picture" xmlns:wps="http://schemas.microsoft.com/office/word/2010/wordprocessingShape" xmlns:wpg="http://schemas.microsoft.com/office/word/2010/wordprocessingGroup" xmlns:mc="http://schemas.openxmlformats.org/markup-compatibility/2006" xmlns:wp14="http://schemas.microsoft.com/office/word/2010/wordprocessingDrawing" xmlns:w14="http://schemas.microsoft.com/office/word/2010/wordml" xmlns:w15="http://schemas.microsoft.com/office/word/2012/wordml" mc:Ignorable="w14 wp14 w15">
   <w:p>
     <w:pPr>
@@ -2374,128 +2284,99 @@
 </w:hdr>
 </file>
 
+<file path=word/header3.xml><?xml version="1.0" encoding="utf-8"?>
+<w:hdr xmlns:o="urn:schemas-microsoft-com:office:office" xmlns:r="http://schemas.openxmlformats.org/officeDocument/2006/relationships" xmlns:v="urn:schemas-microsoft-com:vml" xmlns:w="http://schemas.openxmlformats.org/wordprocessingml/2006/main" xmlns:w10="urn:schemas-microsoft-com:office:word" xmlns:wp="http://schemas.openxmlformats.org/drawingml/2006/wordprocessingDrawing" xmlns:pic="http://schemas.openxmlformats.org/drawingml/2006/picture" xmlns:wps="http://schemas.microsoft.com/office/word/2010/wordprocessingShape" xmlns:wpg="http://schemas.microsoft.com/office/word/2010/wordprocessingGroup" xmlns:mc="http://schemas.openxmlformats.org/markup-compatibility/2006" xmlns:wp14="http://schemas.microsoft.com/office/word/2010/wordprocessingDrawing" xmlns:w14="http://schemas.microsoft.com/office/word/2010/wordml" xmlns:w15="http://schemas.microsoft.com/office/word/2012/wordml" mc:Ignorable="w14 wp14 w15">
+  <w:p>
+    <w:pPr>
+      <w:pStyle w:val="Normal0"/>
+      <w:tabs>
+        <w:tab w:val="clear" w:pos="708"/>
+        <w:tab w:val="left" w:pos="453" w:leader="none"/>
+        <w:tab w:val="right" w:pos="4330" w:leader="none"/>
+      </w:tabs>
+      <w:spacing w:lineRule="auto" w:line="360" w:before="120" w:after="120"/>
+      <w:jc w:val="end"/>
+      <w:rPr>
+        <w:lang w:val="de-DE"/>
+      </w:rPr>
+    </w:pPr>
+    <w:r>
+      <w:rPr>
+        <w:shd w:fill="auto" w:val="clear"/>
+        <w:lang w:val="de-DE"/>
+      </w:rPr>
+      <w:t>Version Februar 2026</w:t>
+    </w:r>
+    <w:r>
+      <w:rPr>
+        <w:lang w:val="de-DE"/>
+      </w:rPr>
+      <w:t xml:space="preserve"> Datum: 2.3.2026</w:t>
+    </w:r>
+  </w:p>
+  <w:p>
+    <w:pPr>
+      <w:pStyle w:val="Normal0"/>
+      <w:tabs>
+        <w:tab w:val="clear" w:pos="708"/>
+        <w:tab w:val="left" w:pos="453" w:leader="none"/>
+        <w:tab w:val="right" w:pos="4330" w:leader="none"/>
+      </w:tabs>
+      <w:spacing w:lineRule="auto" w:line="360" w:before="120" w:after="120"/>
+      <w:jc w:val="end"/>
+      <w:rPr>
+        <w:shd w:fill="auto" w:val="clear"/>
+        <w:lang w:val="de-DE"/>
+      </w:rPr>
+    </w:pPr>
+    <w:r>
+      <w:rPr/>
+      <w:drawing>
+        <wp:inline distT="0" distB="0" distL="0" distR="0">
+          <wp:extent cx="1343025" cy="276225"/>
+          <wp:effectExtent l="0" t="0" r="0" b="0"/>
+          <wp:docPr id="2" name="officeArt object" descr="Logo des Digitalchecks"/>
+          <wp:cNvGraphicFramePr>
+            <a:graphicFrameLocks xmlns:a="http://schemas.openxmlformats.org/drawingml/2006/main" noChangeAspect="1"/>
+          </wp:cNvGraphicFramePr>
+          <a:graphic xmlns:a="http://schemas.openxmlformats.org/drawingml/2006/main">
+            <a:graphicData uri="http://schemas.openxmlformats.org/drawingml/2006/picture">
+              <pic:pic xmlns:pic="http://schemas.openxmlformats.org/drawingml/2006/picture">
+                <pic:nvPicPr>
+                  <pic:cNvPr id="2" name="officeArt object" descr="Logo des Digitalchecks"/>
+                  <pic:cNvPicPr>
+                    <a:picLocks noChangeAspect="1" noChangeArrowheads="1"/>
+                  </pic:cNvPicPr>
+                </pic:nvPicPr>
+                <pic:blipFill>
+                  <a:blip r:embed="rId1"/>
+                  <a:stretch>
+                    <a:fillRect/>
+                  </a:stretch>
+                </pic:blipFill>
+                <pic:spPr bwMode="auto">
+                  <a:xfrm>
+                    <a:off x="0" y="0"/>
+                    <a:ext cx="1343025" cy="276225"/>
+                  </a:xfrm>
+                  <a:prstGeom prst="rect">
+                    <a:avLst/>
+                  </a:prstGeom>
+                  <a:noFill/>
+                </pic:spPr>
+              </pic:pic>
+            </a:graphicData>
+          </a:graphic>
+        </wp:inline>
+      </w:drawing>
+    </w:r>
+  </w:p>
+</w:hdr>
+</file>
+
 <file path=word/numbering.xml><?xml version="1.0" encoding="utf-8"?>
 <w:numbering xmlns:w="http://schemas.openxmlformats.org/wordprocessingml/2006/main" xmlns:o="urn:schemas-microsoft-com:office:office" xmlns:r="http://schemas.openxmlformats.org/officeDocument/2006/relationships" xmlns:v="urn:schemas-microsoft-com:vml" xmlns:mc="http://schemas.openxmlformats.org/markup-compatibility/2006" xmlns:w14="http://schemas.microsoft.com/office/word/2010/wordml" mc:Ignorable="w14">
   <w:abstractNum w:abstractNumId="1">
-    <w:lvl w:ilvl="0">
-      <w:start w:val="1"/>
-      <w:numFmt w:val="none"/>
-      <w:suff w:val="nothing"/>
-      <w:lvlText w:val="%1"/>
-      <w:lvlJc w:val="start"/>
-      <w:pPr>
-        <w:tabs>
-          <w:tab w:val="num" w:pos="0"/>
-        </w:tabs>
-        <w:ind w:start="0" w:hanging="0"/>
-      </w:pPr>
-    </w:lvl>
-    <w:lvl w:ilvl="1">
-      <w:start w:val="1"/>
-      <w:numFmt w:val="none"/>
-      <w:suff w:val="nothing"/>
-      <w:lvlText w:val="%2"/>
-      <w:lvlJc w:val="start"/>
-      <w:pPr>
-        <w:tabs>
-          <w:tab w:val="num" w:pos="0"/>
-        </w:tabs>
-        <w:ind w:start="0" w:hanging="0"/>
-      </w:pPr>
-    </w:lvl>
-    <w:lvl w:ilvl="2">
-      <w:start w:val="1"/>
-      <w:numFmt w:val="none"/>
-      <w:suff w:val="nothing"/>
-      <w:lvlText w:val="%3"/>
-      <w:lvlJc w:val="start"/>
-      <w:pPr>
-        <w:tabs>
-          <w:tab w:val="num" w:pos="0"/>
-        </w:tabs>
-        <w:ind w:start="0" w:hanging="0"/>
-      </w:pPr>
-    </w:lvl>
-    <w:lvl w:ilvl="3">
-      <w:start w:val="1"/>
-      <w:numFmt w:val="none"/>
-      <w:suff w:val="nothing"/>
-      <w:lvlText w:val="%4"/>
-      <w:lvlJc w:val="start"/>
-      <w:pPr>
-        <w:tabs>
-          <w:tab w:val="num" w:pos="0"/>
-        </w:tabs>
-        <w:ind w:start="0" w:hanging="0"/>
-      </w:pPr>
-    </w:lvl>
-    <w:lvl w:ilvl="4">
-      <w:start w:val="1"/>
-      <w:numFmt w:val="none"/>
-      <w:suff w:val="nothing"/>
-      <w:lvlText w:val="%5"/>
-      <w:lvlJc w:val="start"/>
-      <w:pPr>
-        <w:tabs>
-          <w:tab w:val="num" w:pos="0"/>
-        </w:tabs>
-        <w:ind w:start="0" w:hanging="0"/>
-      </w:pPr>
-    </w:lvl>
-    <w:lvl w:ilvl="5">
-      <w:start w:val="1"/>
-      <w:numFmt w:val="none"/>
-      <w:suff w:val="nothing"/>
-      <w:lvlText w:val="%6"/>
-      <w:lvlJc w:val="start"/>
-      <w:pPr>
-        <w:tabs>
-          <w:tab w:val="num" w:pos="0"/>
-        </w:tabs>
-        <w:ind w:start="0" w:hanging="0"/>
-      </w:pPr>
-    </w:lvl>
-    <w:lvl w:ilvl="6">
-      <w:start w:val="1"/>
-      <w:numFmt w:val="none"/>
-      <w:suff w:val="nothing"/>
-      <w:lvlText w:val="%7"/>
-      <w:lvlJc w:val="start"/>
-      <w:pPr>
-        <w:tabs>
-          <w:tab w:val="num" w:pos="0"/>
-        </w:tabs>
-        <w:ind w:start="0" w:hanging="0"/>
-      </w:pPr>
-    </w:lvl>
-    <w:lvl w:ilvl="7">
-      <w:start w:val="1"/>
-      <w:numFmt w:val="none"/>
-      <w:suff w:val="nothing"/>
-      <w:lvlText w:val="%8"/>
-      <w:lvlJc w:val="start"/>
-      <w:pPr>
-        <w:tabs>
-          <w:tab w:val="num" w:pos="0"/>
-        </w:tabs>
-        <w:ind w:start="0" w:hanging="0"/>
-      </w:pPr>
-    </w:lvl>
-    <w:lvl w:ilvl="8">
-      <w:start w:val="1"/>
-      <w:numFmt w:val="none"/>
-      <w:suff w:val="nothing"/>
-      <w:lvlText w:val="%9"/>
-      <w:lvlJc w:val="start"/>
-      <w:pPr>
-        <w:tabs>
-          <w:tab w:val="num" w:pos="0"/>
-        </w:tabs>
-        <w:ind w:start="0" w:hanging="0"/>
-      </w:pPr>
-    </w:lvl>
-  </w:abstractNum>
-  <w:abstractNum w:abstractNumId="2">
     <w:lvl w:ilvl="0">
       <w:start w:val="1"/>
       <w:numFmt w:val="decimal"/>
@@ -2740,7 +2621,7 @@
       </w:rPr>
     </w:lvl>
   </w:abstractNum>
-  <w:abstractNum w:abstractNumId="3">
+  <w:abstractNum w:abstractNumId="2">
     <w:lvl w:ilvl="0">
       <w:start w:val="1"/>
       <w:numFmt w:val="bullet"/>
@@ -3030,7 +2911,7 @@
       </w:rPr>
     </w:lvl>
   </w:abstractNum>
-  <w:abstractNum w:abstractNumId="4">
+  <w:abstractNum w:abstractNumId="3">
     <w:lvl w:ilvl="0">
       <w:start w:val="1"/>
       <w:numFmt w:val="bullet"/>
@@ -3318,6 +3199,125 @@
         <w:sz w:val="20"/>
         <w:vertAlign w:val="baseline"/>
       </w:rPr>
+    </w:lvl>
+  </w:abstractNum>
+  <w:abstractNum w:abstractNumId="4">
+    <w:lvl w:ilvl="0">
+      <w:start w:val="1"/>
+      <w:numFmt w:val="none"/>
+      <w:suff w:val="nothing"/>
+      <w:lvlText w:val=""/>
+      <w:lvlJc w:val="start"/>
+      <w:pPr>
+        <w:tabs>
+          <w:tab w:val="num" w:pos="0"/>
+        </w:tabs>
+        <w:ind w:start="0" w:hanging="0"/>
+      </w:pPr>
+    </w:lvl>
+    <w:lvl w:ilvl="1">
+      <w:start w:val="1"/>
+      <w:numFmt w:val="none"/>
+      <w:suff w:val="nothing"/>
+      <w:lvlText w:val=""/>
+      <w:lvlJc w:val="start"/>
+      <w:pPr>
+        <w:tabs>
+          <w:tab w:val="num" w:pos="0"/>
+        </w:tabs>
+        <w:ind w:start="0" w:hanging="0"/>
+      </w:pPr>
+    </w:lvl>
+    <w:lvl w:ilvl="2">
+      <w:start w:val="1"/>
+      <w:numFmt w:val="none"/>
+      <w:suff w:val="nothing"/>
+      <w:lvlText w:val=""/>
+      <w:lvlJc w:val="start"/>
+      <w:pPr>
+        <w:tabs>
+          <w:tab w:val="num" w:pos="0"/>
+        </w:tabs>
+        <w:ind w:start="0" w:hanging="0"/>
+      </w:pPr>
+    </w:lvl>
+    <w:lvl w:ilvl="3">
+      <w:start w:val="1"/>
+      <w:numFmt w:val="none"/>
+      <w:suff w:val="nothing"/>
+      <w:lvlText w:val=""/>
+      <w:lvlJc w:val="start"/>
+      <w:pPr>
+        <w:tabs>
+          <w:tab w:val="num" w:pos="0"/>
+        </w:tabs>
+        <w:ind w:start="0" w:hanging="0"/>
+      </w:pPr>
+    </w:lvl>
+    <w:lvl w:ilvl="4">
+      <w:start w:val="1"/>
+      <w:numFmt w:val="none"/>
+      <w:suff w:val="nothing"/>
+      <w:lvlText w:val=""/>
+      <w:lvlJc w:val="start"/>
+      <w:pPr>
+        <w:tabs>
+          <w:tab w:val="num" w:pos="0"/>
+        </w:tabs>
+        <w:ind w:start="0" w:hanging="0"/>
+      </w:pPr>
+    </w:lvl>
+    <w:lvl w:ilvl="5">
+      <w:start w:val="1"/>
+      <w:numFmt w:val="none"/>
+      <w:suff w:val="nothing"/>
+      <w:lvlText w:val=""/>
+      <w:lvlJc w:val="start"/>
+      <w:pPr>
+        <w:tabs>
+          <w:tab w:val="num" w:pos="0"/>
+        </w:tabs>
+        <w:ind w:start="0" w:hanging="0"/>
+      </w:pPr>
+    </w:lvl>
+    <w:lvl w:ilvl="6">
+      <w:start w:val="1"/>
+      <w:numFmt w:val="none"/>
+      <w:suff w:val="nothing"/>
+      <w:lvlText w:val=""/>
+      <w:lvlJc w:val="start"/>
+      <w:pPr>
+        <w:tabs>
+          <w:tab w:val="num" w:pos="0"/>
+        </w:tabs>
+        <w:ind w:start="0" w:hanging="0"/>
+      </w:pPr>
+    </w:lvl>
+    <w:lvl w:ilvl="7">
+      <w:start w:val="1"/>
+      <w:numFmt w:val="none"/>
+      <w:suff w:val="nothing"/>
+      <w:lvlText w:val=""/>
+      <w:lvlJc w:val="start"/>
+      <w:pPr>
+        <w:tabs>
+          <w:tab w:val="num" w:pos="0"/>
+        </w:tabs>
+        <w:ind w:start="0" w:hanging="0"/>
+      </w:pPr>
+    </w:lvl>
+    <w:lvl w:ilvl="8">
+      <w:start w:val="1"/>
+      <w:numFmt w:val="none"/>
+      <w:suff w:val="nothing"/>
+      <w:lvlText w:val=""/>
+      <w:lvlJc w:val="start"/>
+      <w:pPr>
+        <w:tabs>
+          <w:tab w:val="num" w:pos="0"/>
+        </w:tabs>
+        <w:ind w:start="0" w:hanging="0"/>
+      </w:pPr>
     </w:lvl>
   </w:abstractNum>
   <w:num w:numId="1">
@@ -3358,18 +3358,15 @@
       <w:keepLines w:val="false"/>
       <w:pageBreakBefore w:val="false"/>
       <w:widowControl/>
-      <w:pBdr/>
       <w:suppressAutoHyphens w:val="false"/>
-      <w:kinsoku w:val="true"/>
-      <w:overflowPunct w:val="true"/>
-      <w:autoSpaceDE w:val="true"/>
+      <w:overflowPunct w:val="false"/>
       <w:bidi w:val="0"/>
       <w:spacing w:lineRule="auto" w:line="240" w:before="0" w:after="0"/>
       <w:ind w:hanging="0" w:start="0" w:end="0"/>
       <w:jc w:val="start"/>
     </w:pPr>
     <w:rPr>
-      <w:rFonts w:ascii="Times New Roman" w:hAnsi="Times New Roman" w:eastAsia="Arial Unicode MS" w:cs="Times New Roman"/>
+      <w:rFonts w:ascii="Arial" w:hAnsi="Arial" w:eastAsia="Arial Unicode MS" w:cs="Times New Roman"/>
       <w:b w:val="false"/>
       <w:bCs w:val="false"/>
       <w:i w:val="false"/>
@@ -3387,11 +3384,11 @@
       <w:w w:val="100"/>
       <w:kern w:val="0"/>
       <w:position w:val="0"/>
-      <w:sz w:val="24"/>
+      <w:sz w:val="20"/>
       <w:szCs w:val="24"/>
       <w:u w:val="none"/>
       <w:vertAlign w:val="baseline"/>
-      <w:lang w:val="en-US" w:eastAsia="en-US" w:bidi="ar-SA"/>
+      <w:lang w:val="de-DE" w:eastAsia="en-US" w:bidi="ar-SA"/>
     </w:rPr>
   </w:style>
   <w:style w:type="paragraph" w:styleId="Heading1">
@@ -3406,11 +3403,8 @@
         <w:ilvl w:val="0"/>
         <w:numId w:val="0"/>
       </w:numPr>
-      <w:pBdr/>
       <w:suppressAutoHyphens w:val="false"/>
-      <w:kinsoku w:val="true"/>
-      <w:overflowPunct w:val="true"/>
-      <w:autoSpaceDE w:val="true"/>
+      <w:overflowPunct w:val="false"/>
       <w:bidi w:val="0"/>
       <w:spacing w:lineRule="auto" w:line="300" w:before="840" w:after="120"/>
       <w:ind w:hanging="0" w:start="0" w:end="0"/>
@@ -3456,11 +3450,8 @@
         <w:ilvl w:val="0"/>
         <w:numId w:val="0"/>
       </w:numPr>
-      <w:pBdr/>
       <w:suppressAutoHyphens w:val="false"/>
-      <w:kinsoku w:val="true"/>
-      <w:overflowPunct w:val="true"/>
-      <w:autoSpaceDE w:val="true"/>
+      <w:overflowPunct w:val="false"/>
       <w:bidi w:val="0"/>
       <w:spacing w:lineRule="auto" w:line="300" w:before="360" w:after="120"/>
       <w:ind w:hanging="0" w:start="0" w:end="0"/>
@@ -3599,11 +3590,8 @@
       <w:keepLines w:val="false"/>
       <w:pageBreakBefore w:val="false"/>
       <w:widowControl/>
-      <w:pBdr/>
       <w:suppressAutoHyphens w:val="false"/>
-      <w:kinsoku w:val="true"/>
-      <w:overflowPunct w:val="true"/>
-      <w:autoSpaceDE w:val="true"/>
+      <w:overflowPunct w:val="false"/>
       <w:bidi w:val="0"/>
       <w:spacing w:lineRule="auto" w:line="300" w:before="180" w:after="120"/>
       <w:ind w:hanging="0" w:start="0" w:end="0"/>
@@ -3644,15 +3632,12 @@
       <w:keepLines w:val="false"/>
       <w:pageBreakBefore w:val="false"/>
       <w:widowControl/>
-      <w:pBdr/>
       <w:tabs>
         <w:tab w:val="clear" w:pos="708"/>
         <w:tab w:val="right" w:pos="9020" w:leader="none"/>
       </w:tabs>
       <w:suppressAutoHyphens w:val="false"/>
-      <w:kinsoku w:val="true"/>
-      <w:overflowPunct w:val="true"/>
-      <w:autoSpaceDE w:val="true"/>
+      <w:overflowPunct w:val="false"/>
       <w:bidi w:val="0"/>
       <w:spacing w:lineRule="auto" w:line="240" w:before="0" w:after="0"/>
       <w:ind w:hanging="0" w:start="0" w:end="0"/>
@@ -3693,11 +3678,8 @@
       <w:keepLines w:val="false"/>
       <w:pageBreakBefore w:val="false"/>
       <w:widowControl/>
-      <w:pBdr/>
       <w:suppressAutoHyphens w:val="false"/>
-      <w:kinsoku w:val="true"/>
-      <w:overflowPunct w:val="true"/>
-      <w:autoSpaceDE w:val="true"/>
+      <w:overflowPunct w:val="false"/>
       <w:bidi w:val="0"/>
       <w:spacing w:lineRule="auto" w:line="300" w:before="180" w:after="120"/>
       <w:ind w:hanging="0" w:start="0" w:end="0"/>
@@ -3738,11 +3720,8 @@
       <w:keepLines w:val="false"/>
       <w:pageBreakBefore w:val="false"/>
       <w:widowControl/>
-      <w:pBdr/>
       <w:suppressAutoHyphens w:val="false"/>
-      <w:kinsoku w:val="true"/>
-      <w:overflowPunct w:val="true"/>
-      <w:autoSpaceDE w:val="true"/>
+      <w:overflowPunct w:val="false"/>
       <w:bidi w:val="0"/>
       <w:spacing w:lineRule="auto" w:line="300" w:before="180" w:after="120"/>
       <w:ind w:hanging="0" w:start="0" w:end="0"/>
@@ -3783,11 +3762,8 @@
       <w:keepLines w:val="false"/>
       <w:pageBreakBefore w:val="false"/>
       <w:widowControl/>
-      <w:pBdr/>
       <w:suppressAutoHyphens w:val="false"/>
-      <w:kinsoku w:val="true"/>
-      <w:overflowPunct w:val="true"/>
-      <w:autoSpaceDE w:val="true"/>
+      <w:overflowPunct w:val="false"/>
       <w:bidi w:val="0"/>
       <w:spacing w:lineRule="auto" w:line="300" w:before="180" w:after="120"/>
       <w:ind w:hanging="0" w:start="0" w:end="0"/>
@@ -3834,11 +3810,9 @@
         <w:bottom w:val="single" w:sz="2" w:space="0" w:color="000000"/>
         <w:right w:val="single" w:sz="2" w:space="0" w:color="000000"/>
       </w:pBdr>
-      <w:shd w:fill="F2F6F8" w:val="clear"/>
+      <w:shd w:val="clear" w:fill="F2F6F8"/>
       <w:suppressAutoHyphens w:val="false"/>
-      <w:kinsoku w:val="true"/>
-      <w:overflowPunct w:val="true"/>
-      <w:autoSpaceDE w:val="true"/>
+      <w:overflowPunct w:val="false"/>
       <w:bidi w:val="0"/>
       <w:spacing w:lineRule="auto" w:line="360" w:before="60" w:after="0"/>
       <w:ind w:hanging="0" w:start="0" w:end="0"/>
@@ -3879,12 +3853,9 @@
       <w:keepLines w:val="false"/>
       <w:pageBreakBefore w:val="false"/>
       <w:widowControl/>
-      <w:pBdr/>
-      <w:shd w:fill="FFF9D2" w:val="clear"/>
+      <w:shd w:val="clear" w:fill="FFF9D2"/>
       <w:suppressAutoHyphens w:val="false"/>
-      <w:kinsoku w:val="true"/>
-      <w:overflowPunct w:val="true"/>
-      <w:autoSpaceDE w:val="true"/>
+      <w:overflowPunct w:val="false"/>
       <w:bidi w:val="0"/>
       <w:spacing w:lineRule="auto" w:line="300" w:before="180" w:after="120"/>
       <w:ind w:hanging="0" w:start="0" w:end="0"/>
@@ -3925,11 +3896,8 @@
       <w:keepLines w:val="false"/>
       <w:pageBreakBefore w:val="false"/>
       <w:widowControl/>
-      <w:pBdr/>
       <w:suppressAutoHyphens w:val="false"/>
-      <w:kinsoku w:val="true"/>
-      <w:overflowPunct w:val="true"/>
-      <w:autoSpaceDE w:val="true"/>
+      <w:overflowPunct w:val="false"/>
       <w:bidi w:val="0"/>
       <w:spacing w:lineRule="auto" w:line="300" w:before="240" w:after="0"/>
       <w:ind w:hanging="0" w:start="708" w:end="0"/>
@@ -4003,6 +3971,13 @@
       <w:sz w:val="20"/>
       <w:szCs w:val="20"/>
     </w:rPr>
+  </w:style>
+  <w:style w:type="paragraph" w:styleId="FrameContentsuser">
+    <w:name w:val="Frame Contents (user)"/>
+    <w:basedOn w:val="Normal"/>
+    <w:qFormat/>
+    <w:pPr/>
+    <w:rPr/>
   </w:style>
   <w:style w:type="numbering" w:styleId="NoList">
     <w:name w:val="No List"/>

</xml_diff>